<commit_message>
feat(customer-share): clean shareable release with generic customer config, sanitized documentation, and dynamic deployment scripts
</commit_message>
<xml_diff>
--- a/Hero_VIDA_Competitor_Intelligence_Executive_Brief.docx
+++ b/Hero_VIDA_Competitor_Intelligence_Executive_Brief.docx
@@ -890,7 +890,7 @@
         <w:br/>
         <w:t>• How it deploys: 1-click deployment using deploy.sh or adk deploy agent_engine.</w:t>
         <w:br/>
-        <w:t>• Live Endpoint: Already deployed on Google Cloud in us-central1 (Instance ID: 8827320801704280064).</w:t>
+        <w:t>• Target Environment: Deployed directly into Hero MotoCorp's Google Cloud project (e.g. us-central1 or asia-south1).</w:t>
       </w:r>
     </w:p>
     <w:p>
@@ -1039,7 +1039,7 @@
               <w:br/>
               <w:t xml:space="preserve">    name='hero_vida_intelligence',</w:t>
               <w:br/>
-              <w:t xml:space="preserve">    address='agentengine://projects/zuhaibp-ai/locations/us-central1/reasoningEngines/8827320801704280064'</w:t>
+              <w:t xml:space="preserve">    address='agentengine://projects/&lt;YOUR_HERO_GCP_PROJECT&gt;/locations/&lt;REGION&gt;/reasoningEngines/&lt;AGENT_ENGINE_ID&gt;'</w:t>
               <w:br/>
               <w:t>)</w:t>
               <w:br/>
@@ -1081,7 +1081,7 @@
           <w:color w:val="D32F2F"/>
           <w:sz w:val="20"/>
         </w:rPr>
-        <w:t>📘 Complete Technical Documentation (README.md)</w:t>
+        <w:t>Complete Technical Documentation (README.md)</w:t>
         <w:br/>
       </w:r>
       <w:r>
@@ -1104,7 +1104,7 @@
           <w:color w:val="D32F2F"/>
           <w:sz w:val="20"/>
         </w:rPr>
-        <w:t>🚀 1-Click Deployment Script (deploy.sh)</w:t>
+        <w:t>1-Click Deployment Script (deploy.sh)</w:t>
         <w:br/>
       </w:r>
       <w:r>
@@ -1112,7 +1112,7 @@
           <w:color w:val="3C4043"/>
           <w:sz w:val="18"/>
         </w:rPr>
-        <w:t>Automated deployment script that handles packaging, container builds, and in-place updates on Vertex AI Agent Engine.</w:t>
+        <w:t>Automated deployment script that prompts for Hero's GCP Project ID, region, and automatically provisions or updates the Agent Engine instance.</w:t>
         <w:br/>
         <w:t>File: deploy.sh in repository root.</w:t>
       </w:r>
@@ -1127,7 +1127,7 @@
           <w:color w:val="D32F2F"/>
           <w:sz w:val="20"/>
         </w:rPr>
-        <w:t>🧪 Comprehensive Automated Test Suite (tests/)</w:t>
+        <w:t>Comprehensive Automated Test Suite (tests/)</w:t>
         <w:br/>
       </w:r>
       <w:r>
@@ -1150,7 +1150,7 @@
           <w:color w:val="D32F2F"/>
           <w:sz w:val="20"/>
         </w:rPr>
-        <w:t>💻 Code Repository</w:t>
+        <w:t>Code Repository</w:t>
         <w:br/>
       </w:r>
       <w:r>
@@ -1160,7 +1160,7 @@
         </w:rPr>
         <w:t>Complete high-code Python repository built with Google ADK:</w:t>
         <w:br/>
-        <w:t>GitHub Repository: https://github.com/zuhaibp656/hero-vida-agent.git</w:t>
+        <w:t>Repository Package: Hero_competitor_analysis_agent (Customer Distribution Branch)</w:t>
       </w:r>
     </w:p>
     <w:p>
@@ -1173,7 +1173,7 @@
           <w:color w:val="D32F2F"/>
           <w:sz w:val="20"/>
         </w:rPr>
-        <w:t>🎮 Live Interactive Playground (Test in Browser Right Now)</w:t>
+        <w:t>Google Cloud Console Vertex AI Playground</w:t>
         <w:br/>
       </w:r>
       <w:r>
@@ -1181,9 +1181,9 @@
           <w:color w:val="3C4043"/>
           <w:sz w:val="18"/>
         </w:rPr>
-        <w:t>Google Cloud Console Vertex AI Playground URL:</w:t>
+        <w:t>Once deployed into Hero's project, the interactive playground is immediately accessible to business users at:</w:t>
         <w:br/>
-        <w:t>https://console.cloud.google.com/vertex-ai/agents/agent-engines/locations/us-central1/agent-engines/8827320801704280064/playground?project=zuhaibp-ai</w:t>
+        <w:t>https://console.cloud.google.com/vertex-ai/agents/agent-engines?project=&lt;YOUR_HERO_GCP_PROJECT&gt;</w:t>
       </w:r>
     </w:p>
     <w:p>
@@ -1196,7 +1196,7 @@
           <w:color w:val="D32F2F"/>
           <w:sz w:val="20"/>
         </w:rPr>
-        <w:t>🪣 Google Cloud Storage Reports Bucket</w:t>
+        <w:t>Google Cloud Storage Reports Bucket</w:t>
         <w:br/>
       </w:r>
       <w:r>
@@ -1204,9 +1204,9 @@
           <w:color w:val="3C4043"/>
           <w:sz w:val="18"/>
         </w:rPr>
-        <w:t>Direct link to generated comparison spreadsheets in Cloud Storage Console:</w:t>
+        <w:t>Generated comparison spreadsheets will automatically reside in Hero's private storage bucket:</w:t>
         <w:br/>
-        <w:t>https://console.cloud.google.com/storage/browser/zuhaibp-ai-hero-vida-reports/reports?project=zuhaibp-ai</w:t>
+        <w:t>gs://&lt;YOUR_HERO_GCP_PROJECT&gt;-hero-vida-reports/reports/</w:t>
       </w:r>
     </w:p>
     <w:p>

</xml_diff>

<commit_message>
style: overhaul Word document formatting, table borders, cell padding, and header/footer styling
</commit_message>
<xml_diff>
--- a/Hero_VIDA_Competitor_Intelligence_Executive_Brief.docx
+++ b/Hero_VIDA_Competitor_Intelligence_Executive_Brief.docx
@@ -6,7 +6,7 @@
       <w:r>
         <w:drawing>
           <wp:inline xmlns:a="http://schemas.openxmlformats.org/drawingml/2006/main" xmlns:pic="http://schemas.openxmlformats.org/drawingml/2006/picture">
-            <wp:extent cx="6217920" cy="1661188"/>
+            <wp:extent cx="6400800" cy="1678287"/>
             <wp:docPr id="1" name="Picture 1"/>
             <wp:cNvGraphicFramePr>
               <a:graphicFrameLocks noChangeAspect="1"/>
@@ -19,7 +19,7 @@
                     <pic:cNvPicPr/>
                   </pic:nvPicPr>
                   <pic:blipFill>
-                    <a:blip r:embed="rId9"/>
+                    <a:blip r:embed="rId11"/>
                     <a:stretch>
                       <a:fillRect/>
                     </a:stretch>
@@ -27,7 +27,7 @@
                   <pic:spPr>
                     <a:xfrm>
                       <a:off x="0" y="0"/>
-                      <a:ext cx="6217920" cy="1661188"/>
+                      <a:ext cx="6400800" cy="1678287"/>
                     </a:xfrm>
                     <a:prstGeom prst="rect"/>
                   </pic:spPr>
@@ -38,29 +38,35 @@
         </w:drawing>
       </w:r>
     </w:p>
-    <w:p>
-      <w:pPr>
-        <w:spacing w:before="80" w:after="160"/>
-      </w:pPr>
-    </w:p>
     <w:tbl>
       <w:tblPr>
         <w:tblW w:type="auto" w:w="0"/>
         <w:jc w:val="center"/>
         <w:tblLayout w:type="fixed"/>
         <w:tblLook w:firstColumn="1" w:firstRow="1" w:lastColumn="0" w:lastRow="0" w:noHBand="0" w:noVBand="1" w:val="04A0"/>
+        <w:tblBorders>
+          <w:top w:val="none"/>
+          <w:bottom w:val="none"/>
+          <w:left w:val="none"/>
+          <w:right w:val="none"/>
+          <w:insideH w:val="none"/>
+          <w:insideV w:val="single" w:sz="4" w:space="0" w:color="E2E8F0"/>
+        </w:tblBorders>
       </w:tblPr>
       <w:tblGrid>
-        <w:gridCol w:w="2448"/>
-        <w:gridCol w:w="2448"/>
-        <w:gridCol w:w="2448"/>
-        <w:gridCol w:w="2448"/>
+        <w:gridCol w:w="2520"/>
+        <w:gridCol w:w="2520"/>
+        <w:gridCol w:w="2520"/>
+        <w:gridCol w:w="2520"/>
       </w:tblGrid>
       <w:tr>
+        <w:trPr>
+          <w:cantSplit/>
+        </w:trPr>
         <w:tc>
           <w:tcPr>
-            <w:tcW w:type="dxa" w:w="2448"/>
-            <w:shd w:fill="F1F3F4"/>
+            <w:tcW w:type="dxa" w:w="2520"/>
+            <w:shd w:fill="F1F5F9"/>
             <w:tcMar>
               <w:top w:w="100" w:type="dxa"/>
               <w:bottom w:w="100" w:type="dxa"/>
@@ -70,15 +76,16 @@
           </w:tcPr>
           <w:p>
             <w:pPr>
+              <w:spacing w:before="0" w:after="0"/>
               <w:jc w:val="center"/>
             </w:pPr>
             <w:r>
               <w:rPr>
                 <w:b/>
-                <w:color w:val="646E78"/>
+                <w:color w:val="64748B"/>
                 <w:sz w:val="15"/>
               </w:rPr>
-              <w:t>PROJECT</w:t>
+              <w:t>DOCUMENT TYPE</w:t>
               <w:br/>
             </w:r>
             <w:r>
@@ -87,14 +94,14 @@
                 <w:color w:val="1A73E8"/>
                 <w:sz w:val="17"/>
               </w:rPr>
-              <w:t>Hero VIDA AI Consultant</w:t>
+              <w:t>Executive Brief &amp; Hand-off</w:t>
             </w:r>
           </w:p>
         </w:tc>
         <w:tc>
           <w:tcPr>
-            <w:tcW w:type="dxa" w:w="2448"/>
-            <w:shd w:fill="F1F3F4"/>
+            <w:tcW w:type="dxa" w:w="2520"/>
+            <w:shd w:fill="F1F5F9"/>
             <w:tcMar>
               <w:top w:w="100" w:type="dxa"/>
               <w:bottom w:w="100" w:type="dxa"/>
@@ -104,12 +111,13 @@
           </w:tcPr>
           <w:p>
             <w:pPr>
+              <w:spacing w:before="0" w:after="0"/>
               <w:jc w:val="center"/>
             </w:pPr>
             <w:r>
               <w:rPr>
                 <w:b/>
-                <w:color w:val="646E78"/>
+                <w:color w:val="64748B"/>
                 <w:sz w:val="15"/>
               </w:rPr>
               <w:t>TARGET AUDIENCE</w:t>
@@ -121,14 +129,14 @@
                 <w:color w:val="1A73E8"/>
                 <w:sz w:val="17"/>
               </w:rPr>
-              <w:t>Hero Leadership &amp; Commercial Teams</w:t>
+              <w:t>Hero Leadership &amp; IT Teams</w:t>
             </w:r>
           </w:p>
         </w:tc>
         <w:tc>
           <w:tcPr>
-            <w:tcW w:type="dxa" w:w="2448"/>
-            <w:shd w:fill="F1F3F4"/>
+            <w:tcW w:type="dxa" w:w="2520"/>
+            <w:shd w:fill="F1F5F9"/>
             <w:tcMar>
               <w:top w:w="100" w:type="dxa"/>
               <w:bottom w:w="100" w:type="dxa"/>
@@ -138,15 +146,16 @@
           </w:tcPr>
           <w:p>
             <w:pPr>
+              <w:spacing w:before="0" w:after="0"/>
               <w:jc w:val="center"/>
             </w:pPr>
             <w:r>
               <w:rPr>
                 <w:b/>
-                <w:color w:val="646E78"/>
+                <w:color w:val="64748B"/>
                 <w:sz w:val="15"/>
               </w:rPr>
-              <w:t>TECH STACK</w:t>
+              <w:t>CORE ENGINE</w:t>
               <w:br/>
             </w:r>
             <w:r>
@@ -161,8 +170,8 @@
         </w:tc>
         <w:tc>
           <w:tcPr>
-            <w:tcW w:type="dxa" w:w="2448"/>
-            <w:shd w:fill="F1F3F4"/>
+            <w:tcW w:type="dxa" w:w="2520"/>
+            <w:shd w:fill="F1F5F9"/>
             <w:tcMar>
               <w:top w:w="100" w:type="dxa"/>
               <w:bottom w:w="100" w:type="dxa"/>
@@ -172,15 +181,16 @@
           </w:tcPr>
           <w:p>
             <w:pPr>
+              <w:spacing w:before="0" w:after="0"/>
               <w:jc w:val="center"/>
             </w:pPr>
             <w:r>
               <w:rPr>
                 <w:b/>
-                <w:color w:val="646E78"/>
+                <w:color w:val="64748B"/>
                 <w:sz w:val="15"/>
               </w:rPr>
-              <w:t>STATUS</w:t>
+              <w:t>DISTRIBUTION</w:t>
               <w:br/>
             </w:r>
             <w:r>
@@ -189,7 +199,7 @@
                 <w:color w:val="1A73E8"/>
                 <w:sz w:val="17"/>
               </w:rPr>
-              <w:t>Active Production Deployment</w:t>
+              <w:t>Customer Distribution Package</w:t>
             </w:r>
           </w:p>
         </w:tc>
@@ -197,24 +207,28 @@
     </w:tbl>
     <w:p>
       <w:pPr>
-        <w:spacing w:after="240"/>
+        <w:spacing w:before="160" w:after="120"/>
       </w:pPr>
     </w:p>
     <w:p>
       <w:pPr>
         <w:pStyle w:val="Heading1"/>
+        <w:keepNext/>
+        <w:spacing w:before="320" w:after="120"/>
       </w:pPr>
       <w:r>
         <w:rPr>
+          <w:rFonts w:ascii="Arial" w:hAnsi="Arial"/>
+          <w:b/>
           <w:color w:val="D32F2F"/>
-          <w:sz w:val="30"/>
+          <w:sz w:val="28"/>
         </w:rPr>
-        <w:t>1. Executive Summary: The Business Challenge &amp; Solution</w:t>
+        <w:t>1. Executive Summary: The Business Challenge &amp; The AI Solution</w:t>
       </w:r>
     </w:p>
     <w:p>
       <w:r>
-        <w:t xml:space="preserve">In India's hyper-competitive electric two-wheeler (EV 2W) market, product pricing and promotional offers change weekly. Key rivals like </w:t>
+        <w:t xml:space="preserve">In India's electric two-wheeler (EV 2W) ecosystem, competitive pricing and promotional incentives change on a weekly basis. Rivals like </w:t>
       </w:r>
       <w:r>
         <w:rPr>
@@ -223,51 +237,66 @@
         <w:t xml:space="preserve">Ather Energy, Bajaj Chetak, TVS iQube, and Ola Electric </w:t>
       </w:r>
       <w:r>
-        <w:t xml:space="preserve">frequently update introductory pricing, festive cash discounts, exchange bonuses, and charger bundle costs. Simultaneously, state governments implement differing EV subsidies, road tax exemptions, and registration fees across cities like </w:t>
-      </w:r>
-      <w:r>
-        <w:rPr>
-          <w:b/>
-        </w:rPr>
-        <w:t>Delhi, Bengaluru, Mumbai, Pune, Ahmedabad, and Chennai.</w:t>
+        <w:t>continually introduce festive cash discounts, exchange bonuses, extended battery warranties, and charger bundle offers. Furthermore, EV subsidies vary radically across states: Delhi, Maharashtra, Karnataka, Gujarat, Tamil Nadu, and Rajasthan each maintain differing road tax exemptions, green cess policies, and municipal registration structures.</w:t>
       </w:r>
     </w:p>
     <w:p>
       <w:r>
-        <w:t>Historically, Hero MotoCorp sales representatives, regional territory managers, and dealership consultants relied on fragmented spreadsheets, stale internal emails, or third-party blogs that frequently contained obsolete prices or discontinued models (such as old V1 units).</w:t>
+        <w:t>Until now, Hero MotoCorp sales directors, regional territory managers, and dealership consultants spent hours manually cross-referencing competitor websites or relying on outdated spreadsheets that frequently quoted discontinued models or missed state subsidies.</w:t>
       </w:r>
     </w:p>
     <w:tbl>
       <w:tblPr>
         <w:tblW w:type="auto" w:w="0"/>
         <w:jc w:val="center"/>
+        <w:tblLayout w:type="fixed"/>
         <w:tblLook w:firstColumn="1" w:firstRow="1" w:lastColumn="0" w:lastRow="0" w:noHBand="0" w:noVBand="1" w:val="04A0"/>
       </w:tblPr>
       <w:tblGrid>
-        <w:gridCol w:w="9792"/>
+        <w:gridCol w:w="10080"/>
       </w:tblGrid>
       <w:tr>
+        <w:trPr>
+          <w:cantSplit/>
+        </w:trPr>
         <w:tc>
           <w:tcPr>
             <w:tcW w:type="dxa" w:w="9792"/>
-            <w:shd w:fill="E8F0FE"/>
+            <w:shd w:fill="EFF6FF"/>
             <w:tcMar>
-              <w:top w:w="140" w:type="dxa"/>
-              <w:bottom w:w="140" w:type="dxa"/>
-              <w:left w:w="180" w:type="dxa"/>
+              <w:top w:w="160" w:type="dxa"/>
+              <w:bottom w:w="160" w:type="dxa"/>
+              <w:left w:w="200" w:type="dxa"/>
               <w:right w:w="180" w:type="dxa"/>
             </w:tcMar>
+            <w:tcBorders>
+              <w:top w:val="single" w:sz="4" w:space="0" w:color="E2E8F0"/>
+              <w:bottom w:val="single" w:sz="4" w:space="0" w:color="E2E8F0"/>
+              <w:left w:val="single" w:sz="32" w:space="0" w:color="1A73E8"/>
+              <w:right w:val="single" w:sz="4" w:space="0" w:color="E2E8F0"/>
+            </w:tcBorders>
           </w:tcPr>
           <w:p>
+            <w:pPr>
+              <w:spacing w:before="0" w:after="80" w:line="276" w:lineRule="auto"/>
+            </w:pPr>
             <w:r>
               <w:rPr>
+                <w:rFonts w:ascii="Arial" w:hAnsi="Arial"/>
                 <w:b/>
                 <w:color w:val="1A73E8"/>
+                <w:sz w:val="21"/>
               </w:rPr>
-              <w:t xml:space="preserve">The Autonomous Solution: </w:t>
+              <w:t>The Solution: Autonomous AI Market Consultant</w:t>
+              <w:br/>
             </w:r>
             <w:r>
-              <w:t>Hero MotoCorp and Google Cloud have deployed the Hero VIDA Competitor Intelligence Multi-Agent. Built on Google ADK and powered by Gemini 2.5 on Vertex AI, the agent executes 100% real-time web crawls against official manufacturer portals, computes exact state and central subsidies, and delivers standardized executive comparison reports with 1-click Cloud Storage CSV downloads in under 30 seconds.</w:t>
+              <w:rPr>
+                <w:rFonts w:ascii="Arial" w:hAnsi="Arial"/>
+                <w:color w:val="2D3748"/>
+                <w:sz w:val="19"/>
+              </w:rPr>
+              <w:t>Hero MotoCorp and Google Cloud have engineered the Hero VIDA Competitor Intelligence Multi-Agent. Built on Google ADK and powered by Gemini 2.5 on Vertex AI, the agent accepts plain-English questions, executes 100% real-time web crawls against official competitor portals, computes exact state and central subsidies, and generates comprehensive comparison tables with 1-click Google Cloud Storage CSV downloads in under 30 seconds.</w:t>
             </w:r>
           </w:p>
         </w:tc>
@@ -275,14 +304,14 @@
     </w:tbl>
     <w:p>
       <w:pPr>
-        <w:spacing w:after="200"/>
+        <w:spacing w:before="0" w:after="160"/>
       </w:pPr>
     </w:p>
     <w:p>
       <w:r>
         <w:drawing>
           <wp:inline xmlns:a="http://schemas.openxmlformats.org/drawingml/2006/main" xmlns:pic="http://schemas.openxmlformats.org/drawingml/2006/picture">
-            <wp:extent cx="6217920" cy="2660188"/>
+            <wp:extent cx="6400800" cy="2805220"/>
             <wp:docPr id="2" name="Picture 2"/>
             <wp:cNvGraphicFramePr>
               <a:graphicFrameLocks noChangeAspect="1"/>
@@ -295,7 +324,7 @@
                     <pic:cNvPicPr/>
                   </pic:nvPicPr>
                   <pic:blipFill>
-                    <a:blip r:embed="rId10"/>
+                    <a:blip r:embed="rId12"/>
                     <a:stretch>
                       <a:fillRect/>
                     </a:stretch>
@@ -303,7 +332,7 @@
                   <pic:spPr>
                     <a:xfrm>
                       <a:off x="0" y="0"/>
-                      <a:ext cx="6217920" cy="2660188"/>
+                      <a:ext cx="6400800" cy="2805220"/>
                     </a:xfrm>
                     <a:prstGeom prst="rect"/>
                   </pic:spPr>
@@ -316,145 +345,224 @@
     </w:p>
     <w:p>
       <w:pPr>
-        <w:spacing w:after="240"/>
+        <w:spacing w:before="80" w:after="240"/>
       </w:pPr>
     </w:p>
     <w:p>
       <w:pPr>
         <w:pStyle w:val="Heading1"/>
+        <w:keepNext/>
+        <w:spacing w:before="320" w:after="120"/>
       </w:pPr>
       <w:r>
         <w:rPr>
+          <w:rFonts w:ascii="Arial" w:hAnsi="Arial"/>
+          <w:b/>
           <w:color w:val="00838F"/>
-          <w:sz w:val="30"/>
+          <w:sz w:val="28"/>
         </w:rPr>
         <w:t>2. What This Agent Does (Plain-English Capabilities)</w:t>
       </w:r>
     </w:p>
     <w:p>
       <w:pPr>
-        <w:spacing w:before="80" w:after="80"/>
+        <w:spacing w:before="60" w:after="40"/>
       </w:pPr>
       <w:r>
         <w:rPr>
+          <w:rFonts w:ascii="Arial" w:hAnsi="Arial"/>
           <w:b/>
-          <w:color w:val="202124"/>
-          <w:sz w:val="22"/>
+          <w:color w:val="0F172A"/>
+          <w:sz w:val="21"/>
         </w:rPr>
-        <w:t>100% Real-Time Live Grounding (Zero Hardcoded Data)</w:t>
+        <w:t>100% Real-Time Web Grounding (Zero Hardcoded Values)</w:t>
         <w:br/>
-      </w:r>
-      <w:r>
-        <w:rPr>
-          <w:color w:val="3C4043"/>
-          <w:sz w:val="19"/>
-        </w:rPr>
-        <w:t>The agent does not guess, hallucinate, or use pre-stored static tables. On every query, it reaches out directly to https://www.vidaworld.com (ingesting live product-master and price-master feeds covering 493 Indian cities) and rival portals (Ather, Chetak, TVS, Ola, River Indie) to pull exact Ex-Showroom prices, battery kWh, certified ranges, and active discounts.</w:t>
       </w:r>
     </w:p>
     <w:p>
       <w:pPr>
-        <w:spacing w:before="80" w:after="80"/>
+        <w:spacing w:before="20" w:after="80"/>
       </w:pPr>
       <w:r>
         <w:rPr>
+          <w:rFonts w:ascii="Arial" w:hAnsi="Arial"/>
+          <w:color w:val="334155"/>
+          <w:sz w:val="19"/>
+        </w:rPr>
+        <w:t>The agent does not guess or query stale static databases. On every inquiry, it initiates live HTTP crawls directly to https://www.vidaworld.com (parsing master feeds across 493 Indian cities) and rival portals (Ather, Chetak, TVS, Ola, River) to extract exact live Ex-Showroom prices, battery kWh, certified ranges, top speeds, and active discounts.</w:t>
+      </w:r>
+    </w:p>
+    <w:p>
+      <w:pPr>
+        <w:spacing w:before="60" w:after="40"/>
+      </w:pPr>
+      <w:r>
+        <w:rPr>
+          <w:rFonts w:ascii="Arial" w:hAnsi="Arial"/>
           <w:b/>
-          <w:color w:val="202124"/>
-          <w:sz w:val="22"/>
+          <w:color w:val="0F172A"/>
+          <w:sz w:val="21"/>
         </w:rPr>
         <w:t>Understands Real Indian Slangs &amp; Regional City Names</w:t>
         <w:br/>
       </w:r>
+    </w:p>
+    <w:p>
+      <w:pPr>
+        <w:spacing w:before="20" w:after="80"/>
+      </w:pPr>
       <w:r>
         <w:rPr>
-          <w:color w:val="3C4043"/>
+          <w:rFonts w:ascii="Arial" w:hAnsi="Arial"/>
+          <w:color w:val="334155"/>
           <w:sz w:val="19"/>
         </w:rPr>
-        <w:t>Non-technical users do not need to format SQL queries or click through dropdowns. They can type or ask in everyday business language using regional slangs: 'dilli' or 'ncr' (Delhi), 'blr' (Bengaluru), 'bombay' or 'mmr' (Mumbai), 'poona' (Pune), 'madras' (Chennai), 'calcutta' (Kolkata), 'hyd' (Hyderabad), 'amdavad' (Ahmedabad), 'pink city' (Jaipur), 'chd' (Chandigarh), and 'lko' (Lucknow).</w:t>
+        <w:t>Users do not need SQL or structured forms. They can converse naturally using everyday regional slangs: 'dilli' or 'ncr' (Delhi), 'blr' (Bengaluru), 'bombay' or 'mmr' (Mumbai), 'poona' (Pune), 'madras' (Chennai), 'calcutta' (Kolkata), 'hyd' (Hyderabad), 'amdavad' (Ahmedabad), 'pink city' (Jaipur), 'chd' (Chandigarh), and 'lko' (Lucknow).</w:t>
       </w:r>
     </w:p>
     <w:p>
       <w:pPr>
-        <w:spacing w:before="80" w:after="80"/>
+        <w:spacing w:before="60" w:after="40"/>
       </w:pPr>
       <w:r>
         <w:rPr>
+          <w:rFonts w:ascii="Arial" w:hAnsi="Arial"/>
           <w:b/>
-          <w:color w:val="202124"/>
-          <w:sz w:val="22"/>
+          <w:color w:val="0F172A"/>
+          <w:sz w:val="21"/>
         </w:rPr>
-        <w:t>Complex Matrix Comparisons &amp; Multi-Turn Memory</w:t>
+        <w:t>Multi-Model &amp; Multi-City Matrix Analysis with Memory</w:t>
         <w:br/>
-      </w:r>
-      <w:r>
-        <w:rPr>
-          <w:color w:val="3C4043"/>
-          <w:sz w:val="19"/>
-        </w:rPr>
-        <w:t>The agent natively understands complex multi-dimensional requests:</w:t>
-        <w:br/>
-        <w:t>• Same company, different models, different cities (e.g. 'Compare VIDA V2 Pro vs VX2 Plus in Delhi and Bangalore')</w:t>
-        <w:br/>
-        <w:t>• Multiple competitors across multiple cities (e.g. 'Ather Rizta vs Chetak C3501 vs TVS iQube in Pune and Ahmedabad')</w:t>
-        <w:br/>
-        <w:t>• Seamless follow-up conversations without resetting context (e.g. 'Now add Chennai too' or 'What about Chetak?').</w:t>
       </w:r>
     </w:p>
     <w:p>
       <w:pPr>
-        <w:spacing w:before="80" w:after="80"/>
+        <w:spacing w:before="20" w:after="80"/>
       </w:pPr>
       <w:r>
         <w:rPr>
+          <w:rFonts w:ascii="Arial" w:hAnsi="Arial"/>
+          <w:color w:val="334155"/>
+          <w:sz w:val="19"/>
+        </w:rPr>
+        <w:t>The agent natively understands complex multi-dimensional requests:</w:t>
+      </w:r>
+    </w:p>
+    <w:p>
+      <w:pPr>
+        <w:pStyle w:val="ListBullet"/>
+        <w:spacing w:before="20" w:after="40"/>
+      </w:pPr>
+      <w:r>
+        <w:rPr>
+          <w:rFonts w:ascii="Arial" w:hAnsi="Arial"/>
+          <w:color w:val="334155"/>
+          <w:sz w:val="19"/>
+        </w:rPr>
+        <w:t>Same brand, multiple models, multiple cities (e.g. 'Compare VIDA V2 Pro vs VX2 Plus in Delhi and Bangalore')</w:t>
+      </w:r>
+    </w:p>
+    <w:p>
+      <w:pPr>
+        <w:pStyle w:val="ListBullet"/>
+        <w:spacing w:before="20" w:after="40"/>
+      </w:pPr>
+      <w:r>
+        <w:rPr>
+          <w:rFonts w:ascii="Arial" w:hAnsi="Arial"/>
+          <w:color w:val="334155"/>
+          <w:sz w:val="19"/>
+        </w:rPr>
+        <w:t>Multiple competitors across multiple cities (e.g. 'Ather Rizta vs Chetak C3501 vs TVS iQube in Pune and Ahmedabad')</w:t>
+      </w:r>
+    </w:p>
+    <w:p>
+      <w:pPr>
+        <w:pStyle w:val="ListBullet"/>
+        <w:spacing w:before="20" w:after="40"/>
+      </w:pPr>
+      <w:r>
+        <w:rPr>
+          <w:rFonts w:ascii="Arial" w:hAnsi="Arial"/>
+          <w:color w:val="334155"/>
+          <w:sz w:val="19"/>
+        </w:rPr>
+        <w:t>Multi-turn conversational memory (e.g. 'Now add Chennai too' or 'What about Chetak?') without losing context.</w:t>
+      </w:r>
+    </w:p>
+    <w:p>
+      <w:pPr>
+        <w:spacing w:before="60" w:after="40"/>
+      </w:pPr>
+      <w:r>
+        <w:rPr>
+          <w:rFonts w:ascii="Arial" w:hAnsi="Arial"/>
           <w:b/>
-          <w:color w:val="202124"/>
-          <w:sz w:val="22"/>
+          <w:color w:val="0F172A"/>
+          <w:sz w:val="21"/>
         </w:rPr>
         <w:t>Exact Central &amp; State EV Subsidy Math</w:t>
         <w:br/>
       </w:r>
+    </w:p>
+    <w:p>
+      <w:pPr>
+        <w:spacing w:before="20" w:after="80"/>
+      </w:pPr>
       <w:r>
         <w:rPr>
-          <w:color w:val="3C4043"/>
+          <w:rFonts w:ascii="Arial" w:hAnsi="Arial"/>
+          <w:color w:val="334155"/>
           <w:sz w:val="19"/>
         </w:rPr>
-        <w:t>It calculates the Government of India's PM E-Drive central subsidy (₹2,500/kWh up to ₹10,000) and city-specific state EV policies (e.g. Delhi EV incentives, Maharashtra EV policies, Gujarat incentives, and state-level RTO tax exemptions), giving exact customer on-road figures.</w:t>
+        <w:t>Automatically applies Government of India PM E-Drive central subsidies (₹2,500/kWh up to ₹10,000) and city-specific state EV incentives (Delhi EV policies, Maharashtra road tax exemptions, Gujarat incentives), computing the true customer On-Road price.</w:t>
       </w:r>
     </w:p>
     <w:p>
       <w:pPr>
-        <w:spacing w:before="80" w:after="80"/>
+        <w:spacing w:before="60" w:after="40"/>
       </w:pPr>
       <w:r>
         <w:rPr>
+          <w:rFonts w:ascii="Arial" w:hAnsi="Arial"/>
           <w:b/>
-          <w:color w:val="202124"/>
-          <w:sz w:val="22"/>
+          <w:color w:val="0F172A"/>
+          <w:sz w:val="21"/>
         </w:rPr>
         <w:t>1-Click CSV Export &amp; Google Cloud Storage Download</w:t>
         <w:br/>
       </w:r>
+    </w:p>
+    <w:p>
+      <w:pPr>
+        <w:spacing w:before="20" w:after="80"/>
+      </w:pPr>
       <w:r>
         <w:rPr>
-          <w:color w:val="3C4043"/>
+          <w:rFonts w:ascii="Arial" w:hAnsi="Arial"/>
+          <w:color w:val="334155"/>
           <w:sz w:val="19"/>
         </w:rPr>
-        <w:t>Every single comparison generates a structured CSV spreadsheet that is automatically uploaded to Google Cloud Storage. The user receives a direct 1-click Google Cloud Console link where they can download the file with one click, a direct storage URL, and a copyable CSV block directly inside the chat window.</w:t>
+        <w:t>Every single analysis produces an RFC-compliant CSV spreadsheet uploaded to Google Cloud Storage. The user receives a direct 1-click Google Cloud Console download link, an authenticated download URL, and a copyable CSV block inside the console.</w:t>
       </w:r>
     </w:p>
     <w:p>
       <w:pPr>
-        <w:spacing w:after="240"/>
+        <w:spacing w:before="80" w:after="160"/>
       </w:pPr>
     </w:p>
     <w:p>
       <w:pPr>
         <w:pStyle w:val="Heading1"/>
+        <w:keepNext/>
+        <w:spacing w:before="320" w:after="120"/>
       </w:pPr>
       <w:r>
         <w:rPr>
+          <w:rFonts w:ascii="Arial" w:hAnsi="Arial"/>
+          <w:b/>
           <w:color w:val="1A73E8"/>
-          <w:sz w:val="30"/>
+          <w:sz w:val="28"/>
         </w:rPr>
         <w:t>3. System Architecture: How It Works</w:t>
       </w:r>
@@ -463,7 +571,7 @@
       <w:r>
         <w:drawing>
           <wp:inline xmlns:a="http://schemas.openxmlformats.org/drawingml/2006/main" xmlns:pic="http://schemas.openxmlformats.org/drawingml/2006/picture">
-            <wp:extent cx="6217920" cy="4221340"/>
+            <wp:extent cx="6400800" cy="4169328"/>
             <wp:docPr id="3" name="Picture 3"/>
             <wp:cNvGraphicFramePr>
               <a:graphicFrameLocks noChangeAspect="1"/>
@@ -476,7 +584,7 @@
                     <pic:cNvPicPr/>
                   </pic:nvPicPr>
                   <pic:blipFill>
-                    <a:blip r:embed="rId11"/>
+                    <a:blip r:embed="rId13"/>
                     <a:stretch>
                       <a:fillRect/>
                     </a:stretch>
@@ -484,7 +592,7 @@
                   <pic:spPr>
                     <a:xfrm>
                       <a:off x="0" y="0"/>
-                      <a:ext cx="6217920" cy="4221340"/>
+                      <a:ext cx="6400800" cy="4169328"/>
                     </a:xfrm>
                     <a:prstGeom prst="rect"/>
                   </pic:spPr>
@@ -497,28 +605,31 @@
     </w:p>
     <w:p>
       <w:pPr>
-        <w:spacing w:after="160"/>
+        <w:spacing w:before="80" w:after="200"/>
       </w:pPr>
       <w:r>
         <w:rPr>
           <w:i/>
-          <w:color w:val="646E78"/>
+          <w:color w:val="64748B"/>
           <w:sz w:val="17"/>
         </w:rPr>
-        <w:t>Figure 1: Architectural Flow from natural language stakeholder inquiry to real-time ingestion, calculation, and CSV generation.</w:t>
+        <w:t>Figure 1: High-level architectural data flow from natural language stakeholder prompt to live web crawls, tax math, and Cloud Storage CSV generation.</w:t>
       </w:r>
     </w:p>
     <w:p>
       <w:pPr>
-        <w:spacing w:before="120"/>
+        <w:pStyle w:val="Heading2"/>
+        <w:keepNext/>
+        <w:spacing w:before="320" w:after="120"/>
       </w:pPr>
-    </w:p>
-    <w:p>
       <w:r>
         <w:rPr>
+          <w:rFonts w:ascii="Arial" w:hAnsi="Arial"/>
           <w:b/>
+          <w:color w:val="0F172A"/>
+          <w:sz w:val="23"/>
         </w:rPr>
-        <w:t>The Google ADK Multi-Agent Team:</w:t>
+        <w:t>The Multi-Agent Team Structure</w:t>
       </w:r>
     </w:p>
     <w:tbl>
@@ -527,19 +638,40 @@
         <w:jc w:val="center"/>
         <w:tblLayout w:type="fixed"/>
         <w:tblLook w:firstColumn="1" w:firstRow="1" w:lastColumn="0" w:lastRow="0" w:noHBand="0" w:noVBand="1" w:val="04A0"/>
+        <w:tblBorders>
+          <w:top w:val="single" w:sz="6" w:space="0" w:color="1E293B"/>
+          <w:bottom w:val="single" w:sz="6" w:space="0" w:color="CBD5E1"/>
+          <w:left w:val="none"/>
+          <w:right w:val="none"/>
+          <w:insideH w:val="single" w:sz="4" w:space="0" w:color="E2E8F0"/>
+          <w:insideV w:val="none"/>
+        </w:tblBorders>
       </w:tblPr>
       <w:tblGrid>
-        <w:gridCol w:w="3264"/>
-        <w:gridCol w:w="3264"/>
-        <w:gridCol w:w="3264"/>
+        <w:gridCol w:w="3360"/>
+        <w:gridCol w:w="3360"/>
+        <w:gridCol w:w="3360"/>
       </w:tblGrid>
       <w:tr>
+        <w:trPr>
+          <w:tblHeader/>
+          <w:cantSplit/>
+        </w:trPr>
         <w:tc>
           <w:tcPr>
-            <w:tcW w:type="dxa" w:w="2592"/>
-            <w:shd w:fill="1F2937"/>
+            <w:tcW w:type="dxa" w:w="2880"/>
+            <w:shd w:fill="1E293B"/>
+            <w:tcMar>
+              <w:top w:w="100" w:type="dxa"/>
+              <w:bottom w:w="100" w:type="dxa"/>
+              <w:left w:w="120" w:type="dxa"/>
+              <w:right w:w="120" w:type="dxa"/>
+            </w:tcMar>
           </w:tcPr>
           <w:p>
+            <w:pPr>
+              <w:spacing w:before="0" w:after="0"/>
+            </w:pPr>
             <w:r>
               <w:rPr>
                 <w:b/>
@@ -553,9 +685,18 @@
         <w:tc>
           <w:tcPr>
             <w:tcW w:type="dxa" w:w="2016"/>
-            <w:shd w:fill="1F2937"/>
+            <w:shd w:fill="1E293B"/>
+            <w:tcMar>
+              <w:top w:w="100" w:type="dxa"/>
+              <w:bottom w:w="100" w:type="dxa"/>
+              <w:left w:w="120" w:type="dxa"/>
+              <w:right w:w="120" w:type="dxa"/>
+            </w:tcMar>
           </w:tcPr>
           <w:p>
+            <w:pPr>
+              <w:spacing w:before="0" w:after="0"/>
+            </w:pPr>
             <w:r>
               <w:rPr>
                 <w:b/>
@@ -569,9 +710,18 @@
         <w:tc>
           <w:tcPr>
             <w:tcW w:type="dxa" w:w="5184"/>
-            <w:shd w:fill="1F2937"/>
+            <w:shd w:fill="1E293B"/>
+            <w:tcMar>
+              <w:top w:w="100" w:type="dxa"/>
+              <w:bottom w:w="100" w:type="dxa"/>
+              <w:left w:w="120" w:type="dxa"/>
+              <w:right w:w="120" w:type="dxa"/>
+            </w:tcMar>
           </w:tcPr>
           <w:p>
+            <w:pPr>
+              <w:spacing w:before="0" w:after="0"/>
+            </w:pPr>
             <w:r>
               <w:rPr>
                 <w:b/>
@@ -584,24 +734,31 @@
         </w:tc>
       </w:tr>
       <w:tr>
+        <w:trPr>
+          <w:cantSplit/>
+        </w:trPr>
         <w:tc>
           <w:tcPr>
-            <w:tcW w:type="dxa" w:w="2592"/>
+            <w:tcW w:type="dxa" w:w="2880"/>
             <w:shd w:fill="FFFFFF"/>
             <w:tcMar>
               <w:top w:w="80" w:type="dxa"/>
               <w:bottom w:w="80" w:type="dxa"/>
-              <w:left w:w="100" w:type="dxa"/>
-              <w:right w:w="100" w:type="dxa"/>
+              <w:left w:w="120" w:type="dxa"/>
+              <w:right w:w="120" w:type="dxa"/>
             </w:tcMar>
           </w:tcPr>
           <w:p>
+            <w:pPr>
+              <w:spacing w:before="0" w:after="0"/>
+            </w:pPr>
             <w:r>
               <w:rPr>
                 <w:b/>
+                <w:color w:val="1E293B"/>
                 <w:sz w:val="17"/>
               </w:rPr>
-              <w:t>🌟 hero_vida_main_agent</w:t>
+              <w:t>hero_vida_main_agent</w:t>
               <w:br/>
               <w:t>(Main Orchestrator)</w:t>
             </w:r>
@@ -614,13 +771,17 @@
             <w:tcMar>
               <w:top w:w="80" w:type="dxa"/>
               <w:bottom w:w="80" w:type="dxa"/>
-              <w:left w:w="100" w:type="dxa"/>
-              <w:right w:w="100" w:type="dxa"/>
+              <w:left w:w="120" w:type="dxa"/>
+              <w:right w:w="120" w:type="dxa"/>
             </w:tcMar>
           </w:tcPr>
           <w:p>
+            <w:pPr>
+              <w:spacing w:before="0" w:after="0"/>
+            </w:pPr>
             <w:r>
               <w:rPr>
+                <w:color w:val="64748B"/>
                 <w:sz w:val="17"/>
               </w:rPr>
               <w:t>Gemini 2.5 Pro</w:t>
@@ -634,58 +795,73 @@
             <w:tcMar>
               <w:top w:w="80" w:type="dxa"/>
               <w:bottom w:w="80" w:type="dxa"/>
-              <w:left w:w="100" w:type="dxa"/>
-              <w:right w:w="100" w:type="dxa"/>
+              <w:left w:w="120" w:type="dxa"/>
+              <w:right w:w="120" w:type="dxa"/>
             </w:tcMar>
           </w:tcPr>
           <w:p>
+            <w:pPr>
+              <w:spacing w:before="0" w:after="0"/>
+            </w:pPr>
             <w:r>
               <w:rPr>
+                <w:color w:val="334155"/>
                 <w:sz w:val="17"/>
               </w:rPr>
-              <w:t>Handles conversational dialogue, normalizes Indian slangs, coordinates the specialist sub-agents, and produces the verified executive report.</w:t>
+              <w:t>Understands natural language dialogue, normalizes Indian city slangs, coordinates the specialist sub-agents, and synthesizes executive insights.</w:t>
             </w:r>
           </w:p>
         </w:tc>
       </w:tr>
       <w:tr>
+        <w:trPr>
+          <w:cantSplit/>
+        </w:trPr>
         <w:tc>
           <w:tcPr>
-            <w:tcW w:type="dxa" w:w="2592"/>
-            <w:shd w:fill="F9FAFB"/>
+            <w:tcW w:type="dxa" w:w="2880"/>
+            <w:shd w:fill="F8FAFC"/>
             <w:tcMar>
               <w:top w:w="80" w:type="dxa"/>
               <w:bottom w:w="80" w:type="dxa"/>
-              <w:left w:w="100" w:type="dxa"/>
-              <w:right w:w="100" w:type="dxa"/>
+              <w:left w:w="120" w:type="dxa"/>
+              <w:right w:w="120" w:type="dxa"/>
             </w:tcMar>
           </w:tcPr>
           <w:p>
+            <w:pPr>
+              <w:spacing w:before="0" w:after="0"/>
+            </w:pPr>
             <w:r>
               <w:rPr>
                 <w:b/>
+                <w:color w:val="1E293B"/>
                 <w:sz w:val="17"/>
               </w:rPr>
-              <w:t>🕷️ crawler_subagent</w:t>
+              <w:t>crawler_subagent</w:t>
               <w:br/>
-              <w:t>(Live Scraper)</w:t>
+              <w:t>(Web Crawler)</w:t>
             </w:r>
           </w:p>
         </w:tc>
         <w:tc>
           <w:tcPr>
             <w:tcW w:type="dxa" w:w="2016"/>
-            <w:shd w:fill="F9FAFB"/>
+            <w:shd w:fill="F8FAFC"/>
             <w:tcMar>
               <w:top w:w="80" w:type="dxa"/>
               <w:bottom w:w="80" w:type="dxa"/>
-              <w:left w:w="100" w:type="dxa"/>
-              <w:right w:w="100" w:type="dxa"/>
+              <w:left w:w="120" w:type="dxa"/>
+              <w:right w:w="120" w:type="dxa"/>
             </w:tcMar>
           </w:tcPr>
           <w:p>
+            <w:pPr>
+              <w:spacing w:before="0" w:after="0"/>
+            </w:pPr>
             <w:r>
               <w:rPr>
+                <w:color w:val="64748B"/>
                 <w:sz w:val="17"/>
               </w:rPr>
               <w:t>Gemini 2.5 Flash</w:t>
@@ -695,45 +871,56 @@
         <w:tc>
           <w:tcPr>
             <w:tcW w:type="dxa" w:w="5184"/>
-            <w:shd w:fill="F9FAFB"/>
+            <w:shd w:fill="F8FAFC"/>
             <w:tcMar>
               <w:top w:w="80" w:type="dxa"/>
               <w:bottom w:w="80" w:type="dxa"/>
-              <w:left w:w="100" w:type="dxa"/>
-              <w:right w:w="100" w:type="dxa"/>
+              <w:left w:w="120" w:type="dxa"/>
+              <w:right w:w="120" w:type="dxa"/>
             </w:tcMar>
           </w:tcPr>
           <w:p>
+            <w:pPr>
+              <w:spacing w:before="0" w:after="0"/>
+            </w:pPr>
             <w:r>
               <w:rPr>
+                <w:color w:val="334155"/>
                 <w:sz w:val="17"/>
               </w:rPr>
-              <w:t>Executes headless real-time web crawlers across official OEM websites; extracts live JSON state, specs, and prices; stores audit data.</w:t>
+              <w:t>Executes headless real-time web crawlers across official OEM websites; extracts live JSON feeds, technical specs, and city prices into sandbox audit storage.</w:t>
             </w:r>
           </w:p>
         </w:tc>
       </w:tr>
       <w:tr>
+        <w:trPr>
+          <w:cantSplit/>
+        </w:trPr>
         <w:tc>
           <w:tcPr>
-            <w:tcW w:type="dxa" w:w="2592"/>
+            <w:tcW w:type="dxa" w:w="2880"/>
             <w:shd w:fill="FFFFFF"/>
             <w:tcMar>
               <w:top w:w="80" w:type="dxa"/>
               <w:bottom w:w="80" w:type="dxa"/>
-              <w:left w:w="100" w:type="dxa"/>
-              <w:right w:w="100" w:type="dxa"/>
+              <w:left w:w="120" w:type="dxa"/>
+              <w:right w:w="120" w:type="dxa"/>
             </w:tcMar>
           </w:tcPr>
           <w:p>
+            <w:pPr>
+              <w:spacing w:before="0" w:after="0"/>
+            </w:pPr>
             <w:r>
               <w:rPr>
                 <w:b/>
+                <w:color w:val="1E293B"/>
                 <w:sz w:val="17"/>
               </w:rPr>
-              <w:t>💰 pricing_subagent</w:t>
+              <w:t>pricing_subagent</w:t>
               <w:br/>
-              <w:t>(Subsidy Specialist)</w:t>
+              <w:t>(Tax &amp; Subsidy Engine)</w:t>
             </w:r>
           </w:p>
         </w:tc>
@@ -744,13 +931,17 @@
             <w:tcMar>
               <w:top w:w="80" w:type="dxa"/>
               <w:bottom w:w="80" w:type="dxa"/>
-              <w:left w:w="100" w:type="dxa"/>
-              <w:right w:w="100" w:type="dxa"/>
+              <w:left w:w="120" w:type="dxa"/>
+              <w:right w:w="120" w:type="dxa"/>
             </w:tcMar>
           </w:tcPr>
           <w:p>
+            <w:pPr>
+              <w:spacing w:before="0" w:after="0"/>
+            </w:pPr>
             <w:r>
               <w:rPr>
+                <w:color w:val="64748B"/>
                 <w:sz w:val="17"/>
               </w:rPr>
               <w:t>Gemini 2.5 Pro</w:t>
@@ -764,39 +955,50 @@
             <w:tcMar>
               <w:top w:w="80" w:type="dxa"/>
               <w:bottom w:w="80" w:type="dxa"/>
-              <w:left w:w="100" w:type="dxa"/>
-              <w:right w:w="100" w:type="dxa"/>
+              <w:left w:w="120" w:type="dxa"/>
+              <w:right w:w="120" w:type="dxa"/>
             </w:tcMar>
           </w:tcPr>
           <w:p>
+            <w:pPr>
+              <w:spacing w:before="0" w:after="0"/>
+            </w:pPr>
             <w:r>
               <w:rPr>
+                <w:color w:val="334155"/>
                 <w:sz w:val="17"/>
               </w:rPr>
-              <w:t>Computes PM E-Drive central subsidies, state EV policy incentives, road tax waivers, and on-road customer prices across 15+ Indian states.</w:t>
+              <w:t>Computes PM E-Drive central subsidies, state EV policy incentives, road tax waivers, and on-road customer pricing across 15+ Indian states.</w:t>
             </w:r>
           </w:p>
         </w:tc>
       </w:tr>
       <w:tr>
+        <w:trPr>
+          <w:cantSplit/>
+        </w:trPr>
         <w:tc>
           <w:tcPr>
-            <w:tcW w:type="dxa" w:w="2592"/>
-            <w:shd w:fill="F9FAFB"/>
+            <w:tcW w:type="dxa" w:w="2880"/>
+            <w:shd w:fill="F8FAFC"/>
             <w:tcMar>
               <w:top w:w="80" w:type="dxa"/>
               <w:bottom w:w="80" w:type="dxa"/>
-              <w:left w:w="100" w:type="dxa"/>
-              <w:right w:w="100" w:type="dxa"/>
+              <w:left w:w="120" w:type="dxa"/>
+              <w:right w:w="120" w:type="dxa"/>
             </w:tcMar>
           </w:tcPr>
           <w:p>
+            <w:pPr>
+              <w:spacing w:before="0" w:after="0"/>
+            </w:pPr>
             <w:r>
               <w:rPr>
                 <w:b/>
+                <w:color w:val="1E293B"/>
                 <w:sz w:val="17"/>
               </w:rPr>
-              <w:t>📊 report_subagent</w:t>
+              <w:t>report_subagent</w:t>
               <w:br/>
               <w:t>(Executive Synthesis)</w:t>
             </w:r>
@@ -805,17 +1007,21 @@
         <w:tc>
           <w:tcPr>
             <w:tcW w:type="dxa" w:w="2016"/>
-            <w:shd w:fill="F9FAFB"/>
+            <w:shd w:fill="F8FAFC"/>
             <w:tcMar>
               <w:top w:w="80" w:type="dxa"/>
               <w:bottom w:w="80" w:type="dxa"/>
-              <w:left w:w="100" w:type="dxa"/>
-              <w:right w:w="100" w:type="dxa"/>
+              <w:left w:w="120" w:type="dxa"/>
+              <w:right w:w="120" w:type="dxa"/>
             </w:tcMar>
           </w:tcPr>
           <w:p>
+            <w:pPr>
+              <w:spacing w:before="0" w:after="0"/>
+            </w:pPr>
             <w:r>
               <w:rPr>
+                <w:color w:val="64748B"/>
                 <w:sz w:val="17"/>
               </w:rPr>
               <w:t>Gemini 2.5 Pro</w:t>
@@ -825,20 +1031,24 @@
         <w:tc>
           <w:tcPr>
             <w:tcW w:type="dxa" w:w="5184"/>
-            <w:shd w:fill="F9FAFB"/>
+            <w:shd w:fill="F8FAFC"/>
             <w:tcMar>
               <w:top w:w="80" w:type="dxa"/>
               <w:bottom w:w="80" w:type="dxa"/>
-              <w:left w:w="100" w:type="dxa"/>
-              <w:right w:w="100" w:type="dxa"/>
+              <w:left w:w="120" w:type="dxa"/>
+              <w:right w:w="120" w:type="dxa"/>
             </w:tcMar>
           </w:tcPr>
           <w:p>
+            <w:pPr>
+              <w:spacing w:before="0" w:after="0"/>
+            </w:pPr>
             <w:r>
               <w:rPr>
+                <w:color w:val="334155"/>
                 <w:sz w:val="17"/>
               </w:rPr>
-              <w:t>Formats side-by-side comparison tables, highlights Hero VIDA competitive advantages, and links to Cloud Storage CSV exports.</w:t>
+              <w:t>Synthesizes side-by-side comparison tables, highlights Hero VIDA competitive advantages (green badge 🟢), and exports CSV datasets to Google Cloud Storage.</w:t>
             </w:r>
           </w:p>
         </w:tc>
@@ -846,32 +1056,37 @@
     </w:tbl>
     <w:p>
       <w:pPr>
-        <w:spacing w:after="240"/>
+        <w:spacing w:before="160" w:after="160"/>
       </w:pPr>
     </w:p>
     <w:p>
       <w:pPr>
         <w:pStyle w:val="Heading1"/>
+        <w:keepNext/>
+        <w:spacing w:before="320" w:after="120"/>
       </w:pPr>
       <w:r>
         <w:rPr>
+          <w:rFonts w:ascii="Arial" w:hAnsi="Arial"/>
+          <w:b/>
           <w:color w:val="D32F2F"/>
-          <w:sz w:val="30"/>
+          <w:sz w:val="28"/>
         </w:rPr>
         <w:t>4. How Hero MotoCorp Can Deploy This Agent</w:t>
       </w:r>
     </w:p>
     <w:p>
       <w:r>
-        <w:t>Depending on Hero MotoCorp's infrastructure preference, security posture, and target audience, the agent can be deployed in three distinct enterprise topologies:</w:t>
+        <w:t>The agent has been engineered for immediate, zero-friction adoption across Hero MotoCorp's technical infrastructure. Depending on the intended audience and security requirements, Hero can choose from three deployment topologies:</w:t>
       </w:r>
     </w:p>
     <w:p>
       <w:pPr>
-        <w:spacing w:before="80" w:after="80"/>
+        <w:spacing w:before="80" w:after="40"/>
       </w:pPr>
       <w:r>
         <w:rPr>
+          <w:rFonts w:ascii="Arial" w:hAnsi="Arial"/>
           <w:b/>
           <w:color w:val="1A73E8"/>
           <w:sz w:val="21"/>
@@ -879,26 +1094,84 @@
         <w:t>Option A: Vertex AI Agent Engine (Recommended — Fully Managed Serverless)</w:t>
         <w:br/>
       </w:r>
+    </w:p>
+    <w:p>
+      <w:pPr>
+        <w:pStyle w:val="ListBullet"/>
+        <w:spacing w:before="20" w:after="40"/>
+      </w:pPr>
       <w:r>
         <w:rPr>
-          <w:color w:val="3C4043"/>
-          <w:sz w:val="18"/>
+          <w:rFonts w:ascii="Arial" w:hAnsi="Arial"/>
+          <w:color w:val="334155"/>
+          <w:sz w:val="19"/>
         </w:rPr>
-        <w:t>• What it is: The agent runs entirely on Google Cloud's managed Vertex AI Agent Engine.</w:t>
-        <w:br/>
-        <w:t>• Business Benefit: Zero servers to manage, automated autoscaling, enterprise security, built-in session state memory, and an interactive Cloud Console Playground for leadership testing.</w:t>
-        <w:br/>
-        <w:t>• How it deploys: 1-click deployment using deploy.sh or adk deploy agent_engine.</w:t>
-        <w:br/>
-        <w:t>• Target Environment: Deployed directly into Hero MotoCorp's Google Cloud project (e.g. us-central1 or asia-south1).</w:t>
+        <w:t>Architecture: Deployed on Google Cloud Vertex AI Reasoning Engine / Agent Engine.</w:t>
       </w:r>
     </w:p>
     <w:p>
       <w:pPr>
-        <w:spacing w:before="80" w:after="80"/>
+        <w:pStyle w:val="ListBullet"/>
+        <w:spacing w:before="20" w:after="40"/>
       </w:pPr>
       <w:r>
         <w:rPr>
+          <w:rFonts w:ascii="Arial" w:hAnsi="Arial"/>
+          <w:color w:val="334155"/>
+          <w:sz w:val="19"/>
+        </w:rPr>
+        <w:t>Business Advantages: Serverless auto-scaling, zero virtual machine management, built-in session state memory, and a secure browser playground for leadership testing.</w:t>
+      </w:r>
+    </w:p>
+    <w:p>
+      <w:pPr>
+        <w:pStyle w:val="ListBullet"/>
+        <w:spacing w:before="20" w:after="40"/>
+      </w:pPr>
+      <w:r>
+        <w:rPr>
+          <w:rFonts w:ascii="Arial" w:hAnsi="Arial"/>
+          <w:color w:val="334155"/>
+          <w:sz w:val="19"/>
+        </w:rPr>
+        <w:t>Deployment Process: 1-click deployment using the included deploy.sh script or adk deploy agent_engine.</w:t>
+      </w:r>
+    </w:p>
+    <w:p>
+      <w:pPr>
+        <w:pStyle w:val="ListBullet"/>
+        <w:spacing w:before="20" w:after="40"/>
+      </w:pPr>
+      <w:r>
+        <w:rPr>
+          <w:rFonts w:ascii="Arial" w:hAnsi="Arial"/>
+          <w:color w:val="334155"/>
+          <w:sz w:val="19"/>
+        </w:rPr>
+        <w:t>Prerequisites: A Google Cloud Project (e.g. hero-digital-ai) with roles/aiplatform.user and roles/storage.objectAdmin.</w:t>
+      </w:r>
+    </w:p>
+    <w:p>
+      <w:pPr>
+        <w:pStyle w:val="ListBullet"/>
+        <w:spacing w:before="20" w:after="40"/>
+      </w:pPr>
+      <w:r>
+        <w:rPr>
+          <w:rFonts w:ascii="Arial" w:hAnsi="Arial"/>
+          <w:color w:val="334155"/>
+          <w:sz w:val="19"/>
+        </w:rPr>
+        <w:t>Access URL: Accessible via Google Cloud Console Vertex AI Playground immediately upon deployment.</w:t>
+      </w:r>
+    </w:p>
+    <w:p>
+      <w:pPr>
+        <w:spacing w:before="80" w:after="40"/>
+      </w:pPr>
+      <w:r>
+        <w:rPr>
+          <w:rFonts w:ascii="Arial" w:hAnsi="Arial"/>
           <w:b/>
           <w:color w:val="1A73E8"/>
           <w:sz w:val="21"/>
@@ -906,72 +1179,139 @@
         <w:t>Option B: Google Cloud Run (Containerized Microservice for Private VPCs)</w:t>
         <w:br/>
       </w:r>
+    </w:p>
+    <w:p>
+      <w:pPr>
+        <w:pStyle w:val="ListBullet"/>
+        <w:spacing w:before="20" w:after="40"/>
+      </w:pPr>
       <w:r>
         <w:rPr>
-          <w:color w:val="3C4043"/>
-          <w:sz w:val="18"/>
+          <w:rFonts w:ascii="Arial" w:hAnsi="Arial"/>
+          <w:color w:val="334155"/>
+          <w:sz w:val="19"/>
         </w:rPr>
-        <w:t>• What it is: Packaged as a standard Docker container hosted on Google Cloud Run.</w:t>
-        <w:br/>
-        <w:t>• Business Benefit: Perfect if Hero wishes to place the agent behind an existing enterprise API Gateway, intranet portal, or secure internal dealership VPN.</w:t>
-        <w:br/>
-        <w:t>• How it deploys: Automated Docker container built via Cloud Build (gcloud run deploy).</w:t>
+        <w:t>Architecture: Packaged as a lightweight container exposing standard REST &amp; WebSocket endpoints.</w:t>
       </w:r>
     </w:p>
     <w:p>
       <w:pPr>
-        <w:spacing w:before="80" w:after="80"/>
+        <w:pStyle w:val="ListBullet"/>
+        <w:spacing w:before="20" w:after="40"/>
       </w:pPr>
       <w:r>
         <w:rPr>
+          <w:rFonts w:ascii="Arial" w:hAnsi="Arial"/>
+          <w:color w:val="334155"/>
+          <w:sz w:val="19"/>
+        </w:rPr>
+        <w:t>Business Advantages: Ideal for integrating behind Hero's existing enterprise API Gateway, internal dealer portals, or intranet applications.</w:t>
+      </w:r>
+    </w:p>
+    <w:p>
+      <w:pPr>
+        <w:pStyle w:val="ListBullet"/>
+        <w:spacing w:before="20" w:after="40"/>
+      </w:pPr>
+      <w:r>
+        <w:rPr>
+          <w:rFonts w:ascii="Arial" w:hAnsi="Arial"/>
+          <w:color w:val="334155"/>
+          <w:sz w:val="19"/>
+        </w:rPr>
+        <w:t>Deployment Process: Automated container build using Google Cloud Build and deployment to Cloud Run with gcloud run deploy.</w:t>
+      </w:r>
+    </w:p>
+    <w:p>
+      <w:pPr>
+        <w:spacing w:before="80" w:after="40"/>
+      </w:pPr>
+      <w:r>
+        <w:rPr>
+          <w:rFonts w:ascii="Arial" w:hAnsi="Arial"/>
           <w:b/>
           <w:color w:val="1A73E8"/>
           <w:sz w:val="21"/>
         </w:rPr>
-        <w:t>Option C: Dealership &amp; Field Rep Local CLI (Direct Desktop Access)</w:t>
+        <w:t>Option C: Dealership &amp; Field Representative Local CLI (Direct Desktop Access)</w:t>
         <w:br/>
-      </w:r>
-      <w:r>
-        <w:rPr>
-          <w:color w:val="3C4043"/>
-          <w:sz w:val="18"/>
-        </w:rPr>
-        <w:t>• What it is: A standalone lightweight Python application that runs on dealer computers or executive laptops.</w:t>
-        <w:br/>
-        <w:t>• Business Benefit: Allows territory managers or sales personnel to run fast benchmarks without requiring cloud console access.</w:t>
-        <w:br/>
-        <w:t>• How it deploys: 1-click launch via run.sh.</w:t>
       </w:r>
     </w:p>
     <w:p>
       <w:pPr>
-        <w:spacing w:after="240"/>
+        <w:pStyle w:val="ListBullet"/>
+        <w:spacing w:before="20" w:after="40"/>
+      </w:pPr>
+      <w:r>
+        <w:rPr>
+          <w:rFonts w:ascii="Arial" w:hAnsi="Arial"/>
+          <w:color w:val="334155"/>
+          <w:sz w:val="19"/>
+        </w:rPr>
+        <w:t>Architecture: Standalone Python application running on dealership workstations or field laptops.</w:t>
+      </w:r>
+    </w:p>
+    <w:p>
+      <w:pPr>
+        <w:pStyle w:val="ListBullet"/>
+        <w:spacing w:before="20" w:after="40"/>
+      </w:pPr>
+      <w:r>
+        <w:rPr>
+          <w:rFonts w:ascii="Arial" w:hAnsi="Arial"/>
+          <w:color w:val="334155"/>
+          <w:sz w:val="19"/>
+        </w:rPr>
+        <w:t>Business Advantages: Enables regional territory managers or sales personnel to perform rapid benchmarks on local PCs without needing cloud console access.</w:t>
+      </w:r>
+    </w:p>
+    <w:p>
+      <w:pPr>
+        <w:pStyle w:val="ListBullet"/>
+        <w:spacing w:before="20" w:after="40"/>
+      </w:pPr>
+      <w:r>
+        <w:rPr>
+          <w:rFonts w:ascii="Arial" w:hAnsi="Arial"/>
+          <w:color w:val="334155"/>
+          <w:sz w:val="19"/>
+        </w:rPr>
+        <w:t>Deployment Process: 1-click launch via ./run.sh or python main.py.</w:t>
+      </w:r>
+    </w:p>
+    <w:p>
+      <w:pPr>
+        <w:spacing w:before="80" w:after="160"/>
       </w:pPr>
     </w:p>
     <w:p>
       <w:pPr>
         <w:pStyle w:val="Heading1"/>
+        <w:keepNext/>
+        <w:spacing w:before="320" w:after="120"/>
       </w:pPr>
       <w:r>
         <w:rPr>
-          <w:color w:val="0F9D58"/>
-          <w:sz w:val="30"/>
+          <w:rFonts w:ascii="Arial" w:hAnsi="Arial"/>
+          <w:b/>
+          <w:color w:val="137333"/>
+          <w:sz w:val="28"/>
         </w:rPr>
         <w:t>5. Agent-to-Agent (A2A) Integration: Sharing with Other Hero Systems</w:t>
       </w:r>
     </w:p>
     <w:p>
       <w:r>
-        <w:t xml:space="preserve">A critical requirement for enterprise AI is that agents should not live in silos. The Hero VIDA Competitor Intelligence Agent natively supports Google's </w:t>
+        <w:t xml:space="preserve">A core architectural differentiator of Google ADK is native </w:t>
       </w:r>
       <w:r>
         <w:rPr>
           <w:b/>
         </w:rPr>
-        <w:t>Agent-to-Agent (A2A) protocol</w:t>
+        <w:t>Agent-to-Agent (A2A) protocol support</w:t>
       </w:r>
       <w:r>
-        <w:t>. This means other digital systems at Hero MotoCorp can consume this agent automatically as an autonomous intelligence specialist.</w:t>
+        <w:t>. This allows the Competitor Intelligence Agent to act as an on-demand specialist service consumable by any other AI agent in Hero MotoCorp's digital portfolio.</w:t>
       </w:r>
     </w:p>
     <w:p>
@@ -980,70 +1320,199 @@
           <w:b/>
         </w:rPr>
         <w:t>Real-World Hero MotoCorp A2A Use Cases:</w:t>
-        <w:br/>
+      </w:r>
+    </w:p>
+    <w:p>
+      <w:pPr>
+        <w:pStyle w:val="ListBullet"/>
+        <w:spacing w:before="40" w:after="60"/>
+      </w:pPr>
+      <w:r>
+        <w:rPr>
+          <w:rFonts w:ascii="Arial" w:hAnsi="Arial"/>
+          <w:b/>
+          <w:color w:val="1E293B"/>
+          <w:sz w:val="19"/>
+        </w:rPr>
+        <w:t xml:space="preserve">Hero Virtual Showroom Chatbot: </w:t>
       </w:r>
       <w:r>
-        <w:t>1. Hero Virtual Showroom Chatbot: When an online customer asks 'Why should I buy VIDA V2 Pro instead of Ather Rizta?', the customer chatbot calls the Competitor Intelligence Agent via A2A to retrieve the latest live prices and subsidies in the customer's city.</w:t>
-        <w:br/>
+        <w:rPr>
+          <w:rFonts w:ascii="Arial" w:hAnsi="Arial"/>
+          <w:color w:val="334155"/>
+          <w:sz w:val="19"/>
+        </w:rPr>
+        <w:t>When an online prospective buyer asks 'Why should I choose VIDA V2 Pro over Ather Rizta in Pune?', the website chatbot automatically delegates the question to the Competitor Intelligence Agent over A2A and embeds the verified price and savings delta in its answer.</w:t>
+      </w:r>
+    </w:p>
+    <w:p>
+      <w:pPr>
+        <w:pStyle w:val="ListBullet"/>
+        <w:spacing w:before="40" w:after="60"/>
+      </w:pPr>
+      <w:r>
+        <w:rPr>
+          <w:rFonts w:ascii="Arial" w:hAnsi="Arial"/>
+          <w:b/>
+          <w:color w:val="1E293B"/>
+          <w:sz w:val="19"/>
+        </w:rPr>
+        <w:t xml:space="preserve">Dealership WhatsApp Assistant: </w:t>
       </w:r>
       <w:r>
-        <w:t>2. Dealership WhatsApp Assistant: Dealer sales agents can send a WhatsApp message like 'Need comparison sheet for VIDA VX2 vs Chetak in Jaipur', and the WhatsApp bot delegates the query to this agent, returning a PDF/CSV directly into the chat.</w:t>
-        <w:br/>
+        <w:rPr>
+          <w:rFonts w:ascii="Arial" w:hAnsi="Arial"/>
+          <w:color w:val="334155"/>
+          <w:sz w:val="19"/>
+        </w:rPr>
+        <w:t>A dealer sales representative texting 'Need comparison sheet for VIDA VX2 vs Chetak in Jaipur' on WhatsApp triggers the WhatsApp bot to query this agent via A2A, instantly receiving a formatted summary and CSV download link.</w:t>
+      </w:r>
+    </w:p>
+    <w:p>
+      <w:pPr>
+        <w:pStyle w:val="ListBullet"/>
+        <w:spacing w:before="40" w:after="60"/>
+      </w:pPr>
+      <w:r>
+        <w:rPr>
+          <w:rFonts w:ascii="Arial" w:hAnsi="Arial"/>
+          <w:b/>
+          <w:color w:val="1E293B"/>
+          <w:sz w:val="19"/>
+        </w:rPr>
+        <w:t xml:space="preserve">Commercial B2B Fleet Sales Tool: </w:t>
       </w:r>
       <w:r>
-        <w:t>3. Enterprise Fleet &amp; Commercial Sales Bot: High-volume B2B fleet buyers evaluating commercial EV scooters can run multi-city TCO benchmarks automatically.</w:t>
-        <w:br/>
+        <w:rPr>
+          <w:rFonts w:ascii="Arial" w:hAnsi="Arial"/>
+          <w:color w:val="334155"/>
+          <w:sz w:val="19"/>
+        </w:rPr>
+        <w:t>Enterprise fleet buyers purchasing delivery fleets can run multi-city TCO benchmarks automatically through Hero's B2B quoting engine.</w:t>
       </w:r>
     </w:p>
     <w:tbl>
       <w:tblPr>
         <w:tblW w:type="auto" w:w="0"/>
         <w:jc w:val="center"/>
+        <w:tblLayout w:type="fixed"/>
         <w:tblLook w:firstColumn="1" w:firstRow="1" w:lastColumn="0" w:lastRow="0" w:noHBand="0" w:noVBand="1" w:val="04A0"/>
       </w:tblPr>
       <w:tblGrid>
-        <w:gridCol w:w="9792"/>
+        <w:gridCol w:w="10080"/>
       </w:tblGrid>
       <w:tr>
+        <w:trPr>
+          <w:cantSplit/>
+        </w:trPr>
         <w:tc>
           <w:tcPr>
             <w:tcW w:type="dxa" w:w="9792"/>
             <w:shd w:fill="F8F9FA"/>
             <w:tcMar>
-              <w:top w:w="120" w:type="dxa"/>
-              <w:bottom w:w="120" w:type="dxa"/>
-              <w:left w:w="160" w:type="dxa"/>
-              <w:right w:w="160" w:type="dxa"/>
+              <w:top w:w="140" w:type="dxa"/>
+              <w:bottom w:w="140" w:type="dxa"/>
+              <w:left w:w="180" w:type="dxa"/>
+              <w:right w:w="180" w:type="dxa"/>
             </w:tcMar>
+            <w:tcBorders>
+              <w:top w:val="single" w:sz="6" w:space="0" w:color="CBD5E1"/>
+              <w:bottom w:val="single" w:sz="6" w:space="0" w:color="CBD5E1"/>
+              <w:left w:val="single" w:sz="6" w:space="0" w:color="CBD5E1"/>
+              <w:right w:val="single" w:sz="6" w:space="0" w:color="CBD5E1"/>
+            </w:tcBorders>
           </w:tcPr>
           <w:p>
+            <w:pPr>
+              <w:spacing w:before="0" w:after="80"/>
+            </w:pPr>
             <w:r>
               <w:rPr>
+                <w:rFonts w:ascii="Arial" w:hAnsi="Arial"/>
                 <w:b/>
+                <w:color w:val="475569"/>
+                <w:sz w:val="18"/>
               </w:rPr>
-              <w:t>How a Hero IT Developer Imports This Agent (Only 4 Lines of Python):</w:t>
+              <w:t>Hero IT Developer Integration (Only 4 Lines of Python):</w:t>
               <w:br/>
             </w:r>
             <w:r>
               <w:rPr>
                 <w:rFonts w:ascii="Courier New" w:hAnsi="Courier New"/>
-                <w:color w:val="212121"/>
+                <w:color w:val="1E293B"/>
                 <w:sz w:val="17"/>
               </w:rPr>
               <w:t>from google.adk.agents.remote_agent import RemoteAgent</w:t>
               <w:br/>
+            </w:r>
+            <w:r>
+              <w:rPr>
+                <w:rFonts w:ascii="Courier New" w:hAnsi="Courier New"/>
+                <w:color w:val="1E293B"/>
+                <w:sz w:val="17"/>
+              </w:rPr>
               <w:br/>
-              <w:t># Connect to the live Hero VIDA Agent via A2A URI:</w:t>
+            </w:r>
+            <w:r>
+              <w:rPr>
+                <w:rFonts w:ascii="Courier New" w:hAnsi="Courier New"/>
+                <w:color w:val="1E293B"/>
+                <w:sz w:val="17"/>
+              </w:rPr>
+              <w:t># Connect to the deployed Hero VIDA Agent via A2A Protocol URI:</w:t>
               <w:br/>
+            </w:r>
+            <w:r>
+              <w:rPr>
+                <w:rFonts w:ascii="Courier New" w:hAnsi="Courier New"/>
+                <w:color w:val="1E293B"/>
+                <w:sz w:val="17"/>
+              </w:rPr>
               <w:t>hero_intelligence = RemoteAgent(</w:t>
               <w:br/>
+            </w:r>
+            <w:r>
+              <w:rPr>
+                <w:rFonts w:ascii="Courier New" w:hAnsi="Courier New"/>
+                <w:color w:val="1E293B"/>
+                <w:sz w:val="17"/>
+              </w:rPr>
               <w:t xml:space="preserve">    name='hero_vida_intelligence',</w:t>
               <w:br/>
-              <w:t xml:space="preserve">    address='agentengine://projects/&lt;YOUR_HERO_GCP_PROJECT&gt;/locations/&lt;REGION&gt;/reasoningEngines/&lt;AGENT_ENGINE_ID&gt;'</w:t>
+            </w:r>
+            <w:r>
+              <w:rPr>
+                <w:rFonts w:ascii="Courier New" w:hAnsi="Courier New"/>
+                <w:color w:val="1E293B"/>
+                <w:sz w:val="17"/>
+              </w:rPr>
+              <w:t xml:space="preserve">    address='agentengine://projects/&lt;YOUR_HERO_GCP_PROJECT&gt;/locations/&lt;REGION&gt;/reasoningEngines/&lt;ENGINE_ID&gt;'</w:t>
               <w:br/>
+            </w:r>
+            <w:r>
+              <w:rPr>
+                <w:rFonts w:ascii="Courier New" w:hAnsi="Courier New"/>
+                <w:color w:val="1E293B"/>
+                <w:sz w:val="17"/>
+              </w:rPr>
               <w:t>)</w:t>
               <w:br/>
-              <w:t># Now your existing customer bots can delegate any competitor query to this specialist!</w:t>
+            </w:r>
+            <w:r>
+              <w:rPr>
+                <w:rFonts w:ascii="Courier New" w:hAnsi="Courier New"/>
+                <w:color w:val="1E293B"/>
+                <w:sz w:val="17"/>
+              </w:rPr>
+              <w:br/>
+            </w:r>
+            <w:r>
+              <w:rPr>
+                <w:rFonts w:ascii="Courier New" w:hAnsi="Courier New"/>
+                <w:color w:val="1E293B"/>
+                <w:sz w:val="17"/>
+              </w:rPr>
+              <w:t># Existing customer chatbots can now delegate any competitor inquiry directly to this specialist!</w:t>
             </w:r>
           </w:p>
         </w:tc>
@@ -1051,222 +1520,289 @@
     </w:tbl>
     <w:p>
       <w:pPr>
-        <w:spacing w:after="240"/>
+        <w:spacing w:before="0" w:after="160"/>
       </w:pPr>
     </w:p>
     <w:p>
       <w:pPr>
         <w:pStyle w:val="Heading1"/>
+        <w:keepNext/>
+        <w:spacing w:before="320" w:after="120"/>
       </w:pPr>
       <w:r>
         <w:rPr>
+          <w:rFonts w:ascii="Arial" w:hAnsi="Arial"/>
+          <w:b/>
           <w:color w:val="1A73E8"/>
-          <w:sz w:val="30"/>
+          <w:sz w:val="28"/>
         </w:rPr>
         <w:t>6. Technical Hand-Off &amp; Developer Resources</w:t>
       </w:r>
     </w:p>
     <w:p>
       <w:r>
-        <w:t>When handing this solution to Hero MotoCorp's engineering or cloud infrastructure team, please provide them with the following assets and pointers:</w:t>
+        <w:t>To transition this solution to Hero MotoCorp's cloud engineering and product teams, share the following repository package and resources:</w:t>
       </w:r>
     </w:p>
     <w:p>
       <w:pPr>
-        <w:spacing w:before="60" w:after="60"/>
+        <w:spacing w:before="60" w:after="40"/>
       </w:pPr>
       <w:r>
         <w:rPr>
+          <w:rFonts w:ascii="Arial" w:hAnsi="Arial"/>
           <w:b/>
           <w:color w:val="D32F2F"/>
           <w:sz w:val="20"/>
         </w:rPr>
-        <w:t>Complete Technical Documentation (README.md)</w:t>
+        <w:t>• Technical Architecture &amp; API Reference (README.md)</w:t>
         <w:br/>
       </w:r>
       <w:r>
         <w:rPr>
-          <w:color w:val="3C4043"/>
+          <w:rFonts w:ascii="Arial" w:hAnsi="Arial"/>
+          <w:color w:val="475569"/>
           <w:sz w:val="18"/>
         </w:rPr>
-        <w:t>Contains full architectural flowcharts, sequence diagrams, detailed API contracts, parameter descriptions, and environment configuration instructions.</w:t>
-        <w:br/>
-        <w:t>File: README.md in repository root.</w:t>
+        <w:t xml:space="preserve">  Comprehensive technical documentation including sequence diagrams, parameter specifications, subsidy formulas, and REST API examples. Located in repository root.</w:t>
       </w:r>
     </w:p>
     <w:p>
       <w:pPr>
-        <w:spacing w:before="60" w:after="60"/>
+        <w:spacing w:before="60" w:after="40"/>
       </w:pPr>
       <w:r>
         <w:rPr>
+          <w:rFonts w:ascii="Arial" w:hAnsi="Arial"/>
           <w:b/>
           <w:color w:val="D32F2F"/>
           <w:sz w:val="20"/>
         </w:rPr>
-        <w:t>1-Click Deployment Script (deploy.sh)</w:t>
+        <w:t>• Automated 1-Click Deployment Script (deploy.sh)</w:t>
         <w:br/>
       </w:r>
       <w:r>
         <w:rPr>
-          <w:color w:val="3C4043"/>
+          <w:rFonts w:ascii="Arial" w:hAnsi="Arial"/>
+          <w:color w:val="475569"/>
           <w:sz w:val="18"/>
         </w:rPr>
-        <w:t>Automated deployment script that prompts for Hero's GCP Project ID, region, and automatically provisions or updates the Agent Engine instance.</w:t>
-        <w:br/>
-        <w:t>File: deploy.sh in repository root.</w:t>
+        <w:t xml:space="preserve">  Automated shell script that authenticates, prompts for Hero's target Google Cloud Project ID and region, and provisions or updates the Agent Engine instance seamlessly.</w:t>
       </w:r>
     </w:p>
     <w:p>
       <w:pPr>
-        <w:spacing w:before="60" w:after="60"/>
+        <w:spacing w:before="60" w:after="40"/>
       </w:pPr>
       <w:r>
         <w:rPr>
+          <w:rFonts w:ascii="Arial" w:hAnsi="Arial"/>
           <w:b/>
           <w:color w:val="D32F2F"/>
           <w:sz w:val="20"/>
         </w:rPr>
-        <w:t>Comprehensive Automated Test Suite (tests/)</w:t>
+        <w:t>• Automated Test Suite (tests/)</w:t>
         <w:br/>
       </w:r>
       <w:r>
         <w:rPr>
-          <w:color w:val="3C4043"/>
+          <w:rFonts w:ascii="Arial" w:hAnsi="Arial"/>
+          <w:color w:val="475569"/>
           <w:sz w:val="18"/>
         </w:rPr>
-        <w:t>Includes 14 automated unit and integration tests verifying real-time web crawlers, subsidy calculations, slang resolvers, and CSV Cloud Storage generation.</w:t>
-        <w:br/>
-        <w:t>Command: PYTHONPATH=. ./venv/bin/pytest tests/ -v (All 14 tests passing).</w:t>
+        <w:t xml:space="preserve">  14 automated unit and integration tests verifying real-time web crawlers, subsidy calculations, slang resolvers, and CSV Cloud Storage generation. Command: PYTHONPATH=. ./venv/bin/pytest tests/ -v (All 14 tests passing).</w:t>
       </w:r>
     </w:p>
     <w:p>
       <w:pPr>
-        <w:spacing w:before="60" w:after="60"/>
+        <w:spacing w:before="60" w:after="40"/>
       </w:pPr>
       <w:r>
         <w:rPr>
+          <w:rFonts w:ascii="Arial" w:hAnsi="Arial"/>
           <w:b/>
           <w:color w:val="D32F2F"/>
           <w:sz w:val="20"/>
         </w:rPr>
-        <w:t>Code Repository</w:t>
+        <w:t>• Code Repository Package</w:t>
         <w:br/>
       </w:r>
       <w:r>
         <w:rPr>
-          <w:color w:val="3C4043"/>
+          <w:rFonts w:ascii="Arial" w:hAnsi="Arial"/>
+          <w:color w:val="475569"/>
           <w:sz w:val="18"/>
         </w:rPr>
-        <w:t>Complete high-code Python repository built with Google ADK:</w:t>
-        <w:br/>
-        <w:t>Repository Package: Hero_competitor_analysis_agent (Customer Distribution Branch)</w:t>
+        <w:t xml:space="preserve">  Complete high-code Python repository built with Google ADK. Shareable via the customer-share branch with clean configuration templates and zero hardcoded personal IDs.</w:t>
       </w:r>
     </w:p>
     <w:p>
       <w:pPr>
-        <w:spacing w:before="60" w:after="60"/>
+        <w:spacing w:before="60" w:after="40"/>
       </w:pPr>
       <w:r>
         <w:rPr>
+          <w:rFonts w:ascii="Arial" w:hAnsi="Arial"/>
           <w:b/>
           <w:color w:val="D32F2F"/>
           <w:sz w:val="20"/>
         </w:rPr>
-        <w:t>Google Cloud Console Vertex AI Playground</w:t>
+        <w:t>• Google Cloud Console Vertex AI Playground</w:t>
         <w:br/>
       </w:r>
       <w:r>
         <w:rPr>
-          <w:color w:val="3C4043"/>
+          <w:rFonts w:ascii="Arial" w:hAnsi="Arial"/>
+          <w:color w:val="475569"/>
           <w:sz w:val="18"/>
         </w:rPr>
-        <w:t>Once deployed into Hero's project, the interactive playground is immediately accessible to business users at:</w:t>
-        <w:br/>
-        <w:t>https://console.cloud.google.com/vertex-ai/agents/agent-engines?project=&lt;YOUR_HERO_GCP_PROJECT&gt;</w:t>
+        <w:t xml:space="preserve">  Once deployed into Hero's Google Cloud project, the interactive web playground is immediately accessible to business users at: https://console.cloud.google.com/vertex-ai/agents/agent-engines?project=&lt;YOUR_HERO_GCP_PROJECT&gt;</w:t>
       </w:r>
     </w:p>
     <w:p>
       <w:pPr>
-        <w:spacing w:before="60" w:after="60"/>
+        <w:spacing w:before="60" w:after="40"/>
       </w:pPr>
       <w:r>
         <w:rPr>
+          <w:rFonts w:ascii="Arial" w:hAnsi="Arial"/>
           <w:b/>
           <w:color w:val="D32F2F"/>
           <w:sz w:val="20"/>
         </w:rPr>
-        <w:t>Google Cloud Storage Reports Bucket</w:t>
+        <w:t>• Google Cloud Storage Reports Bucket</w:t>
         <w:br/>
       </w:r>
       <w:r>
         <w:rPr>
-          <w:color w:val="3C4043"/>
+          <w:rFonts w:ascii="Arial" w:hAnsi="Arial"/>
+          <w:color w:val="475569"/>
           <w:sz w:val="18"/>
         </w:rPr>
-        <w:t>Generated comparison spreadsheets will automatically reside in Hero's private storage bucket:</w:t>
-        <w:br/>
-        <w:t>gs://&lt;YOUR_HERO_GCP_PROJECT&gt;-hero-vida-reports/reports/</w:t>
+        <w:t xml:space="preserve">  Automated CSV exports are stored in Hero's private bucket at: gs://&lt;YOUR_HERO_GCP_PROJECT&gt;-hero-vida-reports/reports/ with direct 1-click console download links.</w:t>
       </w:r>
     </w:p>
     <w:p>
       <w:pPr>
-        <w:spacing w:before="160"/>
+        <w:spacing w:before="160" w:after="80"/>
       </w:pPr>
     </w:p>
     <w:tbl>
       <w:tblPr>
         <w:tblW w:type="auto" w:w="0"/>
         <w:jc w:val="center"/>
+        <w:tblLayout w:type="fixed"/>
         <w:tblLook w:firstColumn="1" w:firstRow="1" w:lastColumn="0" w:lastRow="0" w:noHBand="0" w:noVBand="1" w:val="04A0"/>
       </w:tblPr>
       <w:tblGrid>
-        <w:gridCol w:w="9792"/>
+        <w:gridCol w:w="10080"/>
       </w:tblGrid>
       <w:tr>
+        <w:trPr>
+          <w:cantSplit/>
+        </w:trPr>
         <w:tc>
           <w:tcPr>
             <w:tcW w:type="dxa" w:w="9792"/>
-            <w:shd w:fill="1F2937"/>
+            <w:shd w:fill="1E293B"/>
             <w:tcMar>
-              <w:top w:w="120" w:type="dxa"/>
-              <w:bottom w:w="120" w:type="dxa"/>
-              <w:left w:w="160" w:type="dxa"/>
-              <w:right w:w="160" w:type="dxa"/>
+              <w:top w:w="140" w:type="dxa"/>
+              <w:bottom w:w="140" w:type="dxa"/>
+              <w:left w:w="180" w:type="dxa"/>
+              <w:right w:w="180" w:type="dxa"/>
             </w:tcMar>
           </w:tcPr>
           <w:p>
             <w:pPr>
+              <w:spacing w:before="0" w:after="0"/>
               <w:jc w:val="center"/>
             </w:pPr>
             <w:r>
               <w:rPr>
+                <w:rFonts w:ascii="Arial" w:hAnsi="Arial"/>
                 <w:b/>
                 <w:color w:val="FFFFFF"/>
-                <w:sz w:val="20"/>
+                <w:sz w:val="21"/>
               </w:rPr>
-              <w:t>Hero MotoCorp &amp; Google Cloud | Advanced Agentic AI</w:t>
+              <w:t>Hero MotoCorp &amp; Google Cloud | Strategic AI Initiative</w:t>
               <w:br/>
             </w:r>
             <w:r>
               <w:rPr>
-                <w:color w:val="A0AEC0"/>
-                <w:sz w:val="17"/>
+                <w:rFonts w:ascii="Arial" w:hAnsi="Arial"/>
+                <w:color w:val="94A3B8"/>
+                <w:sz w:val="18"/>
               </w:rPr>
-              <w:t>Delivering Autonomous Real-Time Market Intelligence for the Next Generation of EV Mobility</w:t>
+              <w:t>Empowering Hero Commercial Leadership with Autonomous Real-Time Market Intelligence</w:t>
             </w:r>
           </w:p>
         </w:tc>
       </w:tr>
     </w:tbl>
     <w:sectPr>
+      <w:headerReference w:type="default" r:id="rId9"/>
+      <w:footerReference w:type="default" r:id="rId10"/>
       <w:pgSz w:w="12240" w:h="15840"/>
-      <w:pgMar w:top="1152" w:right="1224" w:bottom="1152" w:left="1224" w:header="720" w:footer="720" w:gutter="0"/>
+      <w:pgMar w:top="1152" w:right="1080" w:bottom="1152" w:left="1080" w:header="720" w:footer="720" w:gutter="0"/>
       <w:cols w:space="720"/>
       <w:docGrid w:linePitch="360"/>
     </w:sectPr>
   </w:body>
 </w:document>
+</file>
+
+<file path=word/footer1.xml><?xml version="1.0" encoding="utf-8"?>
+<w:ftr xmlns:m="http://schemas.openxmlformats.org/officeDocument/2006/math" xmlns:mc="http://schemas.openxmlformats.org/markup-compatibility/2006" xmlns:mo="http://schemas.microsoft.com/office/mac/office/2008/main" xmlns:mv="urn:schemas-microsoft-com:mac:vml" xmlns:o="urn:schemas-microsoft-com:office:office" xmlns:r="http://schemas.openxmlformats.org/officeDocument/2006/relationships" xmlns:v="urn:schemas-microsoft-com:vml" xmlns:w10="urn:schemas-microsoft-com:office:word" xmlns:w14="http://schemas.microsoft.com/office/word/2010/wordml" xmlns:w="http://schemas.openxmlformats.org/wordprocessingml/2006/main" xmlns:wne="http://schemas.microsoft.com/office/word/2006/wordml" xmlns:wp14="http://schemas.microsoft.com/office/word/2010/wordprocessingDrawing" xmlns:wp="http://schemas.openxmlformats.org/drawingml/2006/wordprocessingDrawing" xmlns:wpc="http://schemas.microsoft.com/office/word/2010/wordprocessingCanvas" xmlns:wpg="http://schemas.microsoft.com/office/word/2010/wordprocessingGroup" xmlns:wpi="http://schemas.microsoft.com/office/word/2010/wordprocessingInk" xmlns:wps="http://schemas.microsoft.com/office/word/2010/wordprocessingShape" mc:Ignorable="w14 wp14">
+  <w:p>
+    <w:pPr>
+      <w:pStyle w:val="Footer"/>
+      <w:tabs>
+        <w:tab w:pos="10080" w:val="left"/>
+      </w:tabs>
+    </w:pPr>
+    <w:r/>
+    <w:r>
+      <w:rPr>
+        <w:rFonts w:ascii="Arial" w:hAnsi="Arial"/>
+        <w:color w:val="94A3B8"/>
+        <w:sz w:val="16"/>
+      </w:rPr>
+      <w:t>CONFIDENTIAL • Prepared for Hero MotoCorp Commercial &amp; Product Leadership</w:t>
+    </w:r>
+    <w:r>
+      <w:rPr>
+        <w:rFonts w:ascii="Arial" w:hAnsi="Arial"/>
+        <w:color w:val="94A3B8"/>
+        <w:sz w:val="16"/>
+      </w:rPr>
+      <w:tab/>
+      <w:t xml:space="preserve">Page </w:t>
+      <w:fldChar w:fldCharType="begin"/>
+      <w:instrText xml:space="preserve"> PAGE </w:instrText>
+      <w:fldChar w:fldCharType="separate"/>
+      <w:fldChar w:fldCharType="end"/>
+    </w:r>
+  </w:p>
+</w:ftr>
+</file>
+
+<file path=word/header1.xml><?xml version="1.0" encoding="utf-8"?>
+<w:hdr xmlns:m="http://schemas.openxmlformats.org/officeDocument/2006/math" xmlns:mc="http://schemas.openxmlformats.org/markup-compatibility/2006" xmlns:mo="http://schemas.microsoft.com/office/mac/office/2008/main" xmlns:mv="urn:schemas-microsoft-com:mac:vml" xmlns:o="urn:schemas-microsoft-com:office:office" xmlns:r="http://schemas.openxmlformats.org/officeDocument/2006/relationships" xmlns:v="urn:schemas-microsoft-com:vml" xmlns:w10="urn:schemas-microsoft-com:office:word" xmlns:w14="http://schemas.microsoft.com/office/word/2010/wordml" xmlns:w="http://schemas.openxmlformats.org/wordprocessingml/2006/main" xmlns:wne="http://schemas.microsoft.com/office/word/2006/wordml" xmlns:wp14="http://schemas.microsoft.com/office/word/2010/wordprocessingDrawing" xmlns:wp="http://schemas.openxmlformats.org/drawingml/2006/wordprocessingDrawing" xmlns:wpc="http://schemas.microsoft.com/office/word/2010/wordprocessingCanvas" xmlns:wpg="http://schemas.microsoft.com/office/word/2010/wordprocessingGroup" xmlns:wpi="http://schemas.microsoft.com/office/word/2010/wordprocessingInk" xmlns:wps="http://schemas.microsoft.com/office/word/2010/wordprocessingShape" mc:Ignorable="w14 wp14">
+  <w:p>
+    <w:pPr>
+      <w:pStyle w:val="Header"/>
+      <w:jc w:val="right"/>
+    </w:pPr>
+    <w:r>
+      <w:rPr>
+        <w:rFonts w:ascii="Arial" w:hAnsi="Arial"/>
+        <w:color w:val="94A3B8"/>
+        <w:sz w:val="16"/>
+      </w:rPr>
+      <w:t>Hero MotoCorp &amp; Google Cloud | Autonomous Competitor Intelligence Agent</w:t>
+    </w:r>
+  </w:p>
+</w:hdr>
 </file>
 
 <file path=word/numbering.xml><?xml version="1.0" encoding="utf-8"?>
@@ -1632,10 +2168,13 @@
     <w:name w:val="Normal"/>
     <w:qFormat/>
     <w:rsid w:val="00FC693F"/>
+    <w:pPr>
+      <w:spacing w:line="276" w:lineRule="auto" w:before="40" w:after="120"/>
+    </w:pPr>
     <w:rPr>
       <w:rFonts w:ascii="Arial" w:hAnsi="Arial"/>
-      <w:color w:val="202124"/>
-      <w:sz w:val="21"/>
+      <w:color w:val="1E293B"/>
+      <w:sz w:val="20"/>
     </w:rPr>
   </w:style>
   <w:style w:type="paragraph" w:styleId="Header">

</xml_diff>

<commit_message>
feat: add Gemini Enterprise deployment steps to deploy.sh, README.md, and Executive Brief docx
</commit_message>
<xml_diff>
--- a/Hero_VIDA_Competitor_Intelligence_Executive_Brief.docx
+++ b/Hero_VIDA_Competitor_Intelligence_Executive_Brief.docx
@@ -1091,7 +1091,7 @@
           <w:color w:val="1A73E8"/>
           <w:sz w:val="21"/>
         </w:rPr>
-        <w:t>Option A: Vertex AI Agent Engine (Recommended — Fully Managed Serverless)</w:t>
+        <w:t>Option A: Vertex AI Agent Engine &amp; Gemini Enterprise (Recommended — Managed Serverless)</w:t>
         <w:br/>
       </w:r>
     </w:p>
@@ -1106,7 +1106,7 @@
           <w:color w:val="334155"/>
           <w:sz w:val="19"/>
         </w:rPr>
-        <w:t>Architecture: Deployed on Google Cloud Vertex AI Reasoning Engine / Agent Engine.</w:t>
+        <w:t>Architecture: Deployed on Google Cloud Vertex AI Agent Platform (Reasoning Engine) with native Gemini Enterprise integration.</w:t>
       </w:r>
     </w:p>
     <w:p>
@@ -1120,7 +1120,7 @@
           <w:color w:val="334155"/>
           <w:sz w:val="19"/>
         </w:rPr>
-        <w:t>Business Advantages: Serverless auto-scaling, zero virtual machine management, built-in session state memory, and a secure browser playground for leadership testing.</w:t>
+        <w:t>Business Advantages: Serverless auto-scaling, zero virtual machine management, built-in session state memory, and multi-channel access (Google Cloud Console Playground + Gemini Enterprise chat).</w:t>
       </w:r>
     </w:p>
     <w:p>
@@ -1148,7 +1148,7 @@
           <w:color w:val="334155"/>
           <w:sz w:val="19"/>
         </w:rPr>
-        <w:t>Prerequisites: A Google Cloud Project (e.g. hero-digital-ai) with roles/aiplatform.user and roles/storage.objectAdmin.</w:t>
+        <w:t>Gemini Enterprise Integration: Pre-configured with GOOGLE_GENAI_USE_ENTERPRISE=1 and --gemini_enterprise_app_name=agent. Hero IT links the Reasoning Engine resource (projects/&lt;PROJECT_ID&gt;/locations/&lt;REGION&gt;/reasoningEngines/&lt;ENGINE_ID&gt;) in Vertex AI Agent Space / Gemini Enterprise under 'Connected Agents'.</w:t>
       </w:r>
     </w:p>
     <w:p>
@@ -1162,7 +1162,21 @@
           <w:color w:val="334155"/>
           <w:sz w:val="19"/>
         </w:rPr>
-        <w:t>Access URL: Accessible via Google Cloud Console Vertex AI Playground immediately upon deployment.</w:t>
+        <w:t>Enterprise User Access: Hero sales directors and commercial teams can query the agent directly inside Gemini Enterprise chat via @hero-vida-agent to receive live on-road pricing and 1-click Cloud Storage CSV downloads.</w:t>
+      </w:r>
+    </w:p>
+    <w:p>
+      <w:pPr>
+        <w:pStyle w:val="ListBullet"/>
+        <w:spacing w:before="20" w:after="40"/>
+      </w:pPr>
+      <w:r>
+        <w:rPr>
+          <w:rFonts w:ascii="Arial" w:hAnsi="Arial"/>
+          <w:color w:val="334155"/>
+          <w:sz w:val="19"/>
+        </w:rPr>
+        <w:t>Prerequisites: A Google Cloud Project (e.g. hero-digital-ai) with roles/aiplatform.user and roles/storage.objectAdmin.</w:t>
       </w:r>
     </w:p>
     <w:p>

</xml_diff>

<commit_message>
docs: add public GitHub repository URL to README and Executive Brief Word doc
</commit_message>
<xml_diff>
--- a/Hero_VIDA_Competitor_Intelligence_Executive_Brief.docx
+++ b/Hero_VIDA_Competitor_Intelligence_Executive_Brief.docx
@@ -1638,7 +1638,7 @@
           <w:color w:val="D32F2F"/>
           <w:sz w:val="20"/>
         </w:rPr>
-        <w:t>• Code Repository Package</w:t>
+        <w:t>• Official Public Code Repository (GitHub)</w:t>
         <w:br/>
       </w:r>
       <w:r>
@@ -1647,7 +1647,9 @@
           <w:color w:val="475569"/>
           <w:sz w:val="18"/>
         </w:rPr>
-        <w:t xml:space="preserve">  Complete high-code Python repository built with Google ADK. Shareable via the customer-share branch with clean configuration templates and zero hardcoded personal IDs.</w:t>
+        <w:t xml:space="preserve">  Complete high-code Python multi-agent system built with Google ADK:</w:t>
+        <w:br/>
+        <w:t>https://github.com/zuhaibp656/hero-vida-intelligence-agent</w:t>
       </w:r>
     </w:p>
     <w:p>

</xml_diff>

<commit_message>
docs: add 3-command quickstart card, detailed deployment steps, and public repo link to executive brief docx
</commit_message>
<xml_diff>
--- a/Hero_VIDA_Competitor_Intelligence_Executive_Brief.docx
+++ b/Hero_VIDA_Competitor_Intelligence_Executive_Brief.docx
@@ -155,7 +155,7 @@
                 <w:color w:val="64748B"/>
                 <w:sz w:val="15"/>
               </w:rPr>
-              <w:t>CORE ENGINE</w:t>
+              <w:t>CORE AI PLATFORM</w:t>
               <w:br/>
             </w:r>
             <w:r>
@@ -164,7 +164,7 @@
                 <w:color w:val="1A73E8"/>
                 <w:sz w:val="17"/>
               </w:rPr>
-              <w:t>Google ADK &amp; Gemini 2.5</w:t>
+              <w:t>Vertex AI &amp; Gemini Enterprise</w:t>
             </w:r>
           </w:p>
         </w:tc>
@@ -190,7 +190,7 @@
                 <w:color w:val="64748B"/>
                 <w:sz w:val="15"/>
               </w:rPr>
-              <w:t>DISTRIBUTION</w:t>
+              <w:t>PUBLIC GITHUB REPO</w:t>
               <w:br/>
             </w:r>
             <w:r>
@@ -199,7 +199,7 @@
                 <w:color w:val="1A73E8"/>
                 <w:sz w:val="17"/>
               </w:rPr>
-              <w:t>Customer Distribution Package</w:t>
+              <w:t>hero-vida-intelligence-agent</w:t>
             </w:r>
           </w:p>
         </w:tc>
@@ -1077,8 +1077,149 @@
     </w:p>
     <w:p>
       <w:r>
-        <w:t>The agent has been engineered for immediate, zero-friction adoption across Hero MotoCorp's technical infrastructure. Depending on the intended audience and security requirements, Hero can choose from three deployment topologies:</w:t>
+        <w:t>The agent has been engineered for immediate, zero-friction adoption across Hero MotoCorp's technical infrastructure. Hero's IT and cloud engineering teams can deploy the multi-agent system directly into Hero's Google Cloud environment in under 5 minutes.</w:t>
       </w:r>
+    </w:p>
+    <w:tbl>
+      <w:tblPr>
+        <w:tblW w:type="auto" w:w="0"/>
+        <w:jc w:val="center"/>
+        <w:tblLayout w:type="fixed"/>
+        <w:tblLook w:firstColumn="1" w:firstRow="1" w:lastColumn="0" w:lastRow="0" w:noHBand="0" w:noVBand="1" w:val="04A0"/>
+      </w:tblPr>
+      <w:tblGrid>
+        <w:gridCol w:w="10080"/>
+      </w:tblGrid>
+      <w:tr>
+        <w:trPr>
+          <w:cantSplit/>
+        </w:trPr>
+        <w:tc>
+          <w:tcPr>
+            <w:tcW w:type="dxa" w:w="9792"/>
+            <w:shd w:fill="F8F9FA"/>
+            <w:tcMar>
+              <w:top w:w="140" w:type="dxa"/>
+              <w:bottom w:w="140" w:type="dxa"/>
+              <w:left w:w="180" w:type="dxa"/>
+              <w:right w:w="180" w:type="dxa"/>
+            </w:tcMar>
+            <w:tcBorders>
+              <w:top w:val="single" w:sz="6" w:space="0" w:color="CBD5E1"/>
+              <w:bottom w:val="single" w:sz="6" w:space="0" w:color="CBD5E1"/>
+              <w:left w:val="single" w:sz="6" w:space="0" w:color="CBD5E1"/>
+              <w:right w:val="single" w:sz="6" w:space="0" w:color="CBD5E1"/>
+            </w:tcBorders>
+          </w:tcPr>
+          <w:p>
+            <w:pPr>
+              <w:spacing w:before="0" w:after="80"/>
+            </w:pPr>
+            <w:r>
+              <w:rPr>
+                <w:rFonts w:ascii="Arial" w:hAnsi="Arial"/>
+                <w:b/>
+                <w:color w:val="475569"/>
+                <w:sz w:val="18"/>
+              </w:rPr>
+              <w:t>Hero IT Quickstart (Deploy in 3 Commands):</w:t>
+              <w:br/>
+            </w:r>
+            <w:r>
+              <w:rPr>
+                <w:rFonts w:ascii="Courier New" w:hAnsi="Courier New"/>
+                <w:color w:val="1E293B"/>
+                <w:sz w:val="17"/>
+              </w:rPr>
+              <w:t># Step 1: Clone the official public customer repository</w:t>
+              <w:br/>
+            </w:r>
+            <w:r>
+              <w:rPr>
+                <w:rFonts w:ascii="Courier New" w:hAnsi="Courier New"/>
+                <w:color w:val="1E293B"/>
+                <w:sz w:val="17"/>
+              </w:rPr>
+              <w:t>git clone https://github.com/zuhaibp656/hero-vida-intelligence-agent.git</w:t>
+              <w:br/>
+            </w:r>
+            <w:r>
+              <w:rPr>
+                <w:rFonts w:ascii="Courier New" w:hAnsi="Courier New"/>
+                <w:color w:val="1E293B"/>
+                <w:sz w:val="17"/>
+              </w:rPr>
+              <w:t>cd hero-vida-intelligence-agent</w:t>
+              <w:br/>
+            </w:r>
+            <w:r>
+              <w:rPr>
+                <w:rFonts w:ascii="Courier New" w:hAnsi="Courier New"/>
+                <w:color w:val="1E293B"/>
+                <w:sz w:val="17"/>
+              </w:rPr>
+              <w:br/>
+            </w:r>
+            <w:r>
+              <w:rPr>
+                <w:rFonts w:ascii="Courier New" w:hAnsi="Courier New"/>
+                <w:color w:val="1E293B"/>
+                <w:sz w:val="17"/>
+              </w:rPr>
+              <w:t># Step 2: Authenticate with Hero MotoCorp's Google Cloud account</w:t>
+              <w:br/>
+            </w:r>
+            <w:r>
+              <w:rPr>
+                <w:rFonts w:ascii="Courier New" w:hAnsi="Courier New"/>
+                <w:color w:val="1E293B"/>
+                <w:sz w:val="17"/>
+              </w:rPr>
+              <w:t>gcloud auth login</w:t>
+              <w:br/>
+            </w:r>
+            <w:r>
+              <w:rPr>
+                <w:rFonts w:ascii="Courier New" w:hAnsi="Courier New"/>
+                <w:color w:val="1E293B"/>
+                <w:sz w:val="17"/>
+              </w:rPr>
+              <w:t>gcloud auth application-default login</w:t>
+              <w:br/>
+            </w:r>
+            <w:r>
+              <w:rPr>
+                <w:rFonts w:ascii="Courier New" w:hAnsi="Courier New"/>
+                <w:color w:val="1E293B"/>
+                <w:sz w:val="17"/>
+              </w:rPr>
+              <w:br/>
+            </w:r>
+            <w:r>
+              <w:rPr>
+                <w:rFonts w:ascii="Courier New" w:hAnsi="Courier New"/>
+                <w:color w:val="1E293B"/>
+                <w:sz w:val="17"/>
+              </w:rPr>
+              <w:t># Step 3: Run the automated 1-click deployment script</w:t>
+              <w:br/>
+            </w:r>
+            <w:r>
+              <w:rPr>
+                <w:rFonts w:ascii="Courier New" w:hAnsi="Courier New"/>
+                <w:color w:val="1E293B"/>
+                <w:sz w:val="17"/>
+              </w:rPr>
+              <w:t>./deploy.sh</w:t>
+            </w:r>
+          </w:p>
+        </w:tc>
+      </w:tr>
+    </w:tbl>
+    <w:p>
+      <w:pPr>
+        <w:spacing w:before="0" w:after="160"/>
+      </w:pPr>
     </w:p>
     <w:p>
       <w:pPr>
@@ -1162,7 +1303,7 @@
           <w:color w:val="334155"/>
           <w:sz w:val="19"/>
         </w:rPr>
-        <w:t>Enterprise User Access: Hero sales directors and commercial teams can query the agent directly inside Gemini Enterprise chat via @hero-vida-agent to receive live on-road pricing and 1-click Cloud Storage CSV downloads.</w:t>
+        <w:t>Enterprise User Access: Hero sales directors, territory managers, and commercial teams can query the agent directly inside Gemini Enterprise chat via @hero-vida-agent to receive live on-road pricing and 1-click Cloud Storage CSV downloads.</w:t>
       </w:r>
     </w:p>
     <w:p>
@@ -1569,75 +1710,6 @@
           <w:color w:val="D32F2F"/>
           <w:sz w:val="20"/>
         </w:rPr>
-        <w:t>• Technical Architecture &amp; API Reference (README.md)</w:t>
-        <w:br/>
-      </w:r>
-      <w:r>
-        <w:rPr>
-          <w:rFonts w:ascii="Arial" w:hAnsi="Arial"/>
-          <w:color w:val="475569"/>
-          <w:sz w:val="18"/>
-        </w:rPr>
-        <w:t xml:space="preserve">  Comprehensive technical documentation including sequence diagrams, parameter specifications, subsidy formulas, and REST API examples. Located in repository root.</w:t>
-      </w:r>
-    </w:p>
-    <w:p>
-      <w:pPr>
-        <w:spacing w:before="60" w:after="40"/>
-      </w:pPr>
-      <w:r>
-        <w:rPr>
-          <w:rFonts w:ascii="Arial" w:hAnsi="Arial"/>
-          <w:b/>
-          <w:color w:val="D32F2F"/>
-          <w:sz w:val="20"/>
-        </w:rPr>
-        <w:t>• Automated 1-Click Deployment Script (deploy.sh)</w:t>
-        <w:br/>
-      </w:r>
-      <w:r>
-        <w:rPr>
-          <w:rFonts w:ascii="Arial" w:hAnsi="Arial"/>
-          <w:color w:val="475569"/>
-          <w:sz w:val="18"/>
-        </w:rPr>
-        <w:t xml:space="preserve">  Automated shell script that authenticates, prompts for Hero's target Google Cloud Project ID and region, and provisions or updates the Agent Engine instance seamlessly.</w:t>
-      </w:r>
-    </w:p>
-    <w:p>
-      <w:pPr>
-        <w:spacing w:before="60" w:after="40"/>
-      </w:pPr>
-      <w:r>
-        <w:rPr>
-          <w:rFonts w:ascii="Arial" w:hAnsi="Arial"/>
-          <w:b/>
-          <w:color w:val="D32F2F"/>
-          <w:sz w:val="20"/>
-        </w:rPr>
-        <w:t>• Automated Test Suite (tests/)</w:t>
-        <w:br/>
-      </w:r>
-      <w:r>
-        <w:rPr>
-          <w:rFonts w:ascii="Arial" w:hAnsi="Arial"/>
-          <w:color w:val="475569"/>
-          <w:sz w:val="18"/>
-        </w:rPr>
-        <w:t xml:space="preserve">  14 automated unit and integration tests verifying real-time web crawlers, subsidy calculations, slang resolvers, and CSV Cloud Storage generation. Command: PYTHONPATH=. ./venv/bin/pytest tests/ -v (All 14 tests passing).</w:t>
-      </w:r>
-    </w:p>
-    <w:p>
-      <w:pPr>
-        <w:spacing w:before="60" w:after="40"/>
-      </w:pPr>
-      <w:r>
-        <w:rPr>
-          <w:rFonts w:ascii="Arial" w:hAnsi="Arial"/>
-          <w:b/>
-          <w:color w:val="D32F2F"/>
-          <w:sz w:val="20"/>
-        </w:rPr>
         <w:t>• Official Public Code Repository (GitHub)</w:t>
         <w:br/>
       </w:r>
@@ -1663,6 +1735,98 @@
           <w:color w:val="D32F2F"/>
           <w:sz w:val="20"/>
         </w:rPr>
+        <w:t>• Technical Architecture &amp; API Reference (README.md)</w:t>
+        <w:br/>
+      </w:r>
+      <w:r>
+        <w:rPr>
+          <w:rFonts w:ascii="Arial" w:hAnsi="Arial"/>
+          <w:color w:val="475569"/>
+          <w:sz w:val="18"/>
+        </w:rPr>
+        <w:t xml:space="preserve">  Comprehensive technical documentation including sequence diagrams, parameter specifications, subsidy formulas, and Gemini Enterprise configuration. Located in repository root.</w:t>
+      </w:r>
+    </w:p>
+    <w:p>
+      <w:pPr>
+        <w:spacing w:before="60" w:after="40"/>
+      </w:pPr>
+      <w:r>
+        <w:rPr>
+          <w:rFonts w:ascii="Arial" w:hAnsi="Arial"/>
+          <w:b/>
+          <w:color w:val="D32F2F"/>
+          <w:sz w:val="20"/>
+        </w:rPr>
+        <w:t>• Automated 1-Click Deployment Script (deploy.sh)</w:t>
+        <w:br/>
+      </w:r>
+      <w:r>
+        <w:rPr>
+          <w:rFonts w:ascii="Arial" w:hAnsi="Arial"/>
+          <w:color w:val="475569"/>
+          <w:sz w:val="18"/>
+        </w:rPr>
+        <w:t xml:space="preserve">  Automated shell script that authenticates, prompts for Hero's target Google Cloud Project ID and region, and provisions the Agent Platform instance with Gemini Enterprise support.</w:t>
+      </w:r>
+    </w:p>
+    <w:p>
+      <w:pPr>
+        <w:spacing w:before="60" w:after="40"/>
+      </w:pPr>
+      <w:r>
+        <w:rPr>
+          <w:rFonts w:ascii="Arial" w:hAnsi="Arial"/>
+          <w:b/>
+          <w:color w:val="D32F2F"/>
+          <w:sz w:val="20"/>
+        </w:rPr>
+        <w:t>• Automated Test Suite (tests/)</w:t>
+        <w:br/>
+      </w:r>
+      <w:r>
+        <w:rPr>
+          <w:rFonts w:ascii="Arial" w:hAnsi="Arial"/>
+          <w:color w:val="475569"/>
+          <w:sz w:val="18"/>
+        </w:rPr>
+        <w:t xml:space="preserve">  14 automated unit and integration tests verifying real-time web crawlers, subsidy calculations, slang resolvers, and CSV Cloud Storage generation. Command: PYTHONPATH=. ./venv/bin/pytest tests/ -v (100% passing).</w:t>
+      </w:r>
+    </w:p>
+    <w:p>
+      <w:pPr>
+        <w:spacing w:before="60" w:after="40"/>
+      </w:pPr>
+      <w:r>
+        <w:rPr>
+          <w:rFonts w:ascii="Arial" w:hAnsi="Arial"/>
+          <w:b/>
+          <w:color w:val="D32F2F"/>
+          <w:sz w:val="20"/>
+        </w:rPr>
+        <w:t>• Gemini Enterprise &amp; Agent Space Integration</w:t>
+        <w:br/>
+      </w:r>
+      <w:r>
+        <w:rPr>
+          <w:rFonts w:ascii="Arial" w:hAnsi="Arial"/>
+          <w:color w:val="475569"/>
+          <w:sz w:val="18"/>
+        </w:rPr>
+        <w:t xml:space="preserve">  Once registered under Connected Agents in Vertex AI Agent Space, Hero commercial leadership and sales teams can query @hero-vida-agent directly inside enterprise chat.</w:t>
+      </w:r>
+    </w:p>
+    <w:p>
+      <w:pPr>
+        <w:spacing w:before="60" w:after="40"/>
+      </w:pPr>
+      <w:r>
+        <w:rPr>
+          <w:rFonts w:ascii="Arial" w:hAnsi="Arial"/>
+          <w:b/>
+          <w:color w:val="D32F2F"/>
+          <w:sz w:val="20"/>
+        </w:rPr>
         <w:t>• Google Cloud Console Vertex AI Playground</w:t>
         <w:br/>
       </w:r>
@@ -1672,7 +1836,7 @@
           <w:color w:val="475569"/>
           <w:sz w:val="18"/>
         </w:rPr>
-        <w:t xml:space="preserve">  Once deployed into Hero's Google Cloud project, the interactive web playground is immediately accessible to business users at: https://console.cloud.google.com/vertex-ai/agents/agent-engines?project=&lt;YOUR_HERO_GCP_PROJECT&gt;</w:t>
+        <w:t xml:space="preserve">  Interactive browser test playground accessible immediately upon deployment at: https://console.cloud.google.com/vertex-ai/agents/agent-engines?project=&lt;YOUR_HERO_GCP_PROJECT&gt;</w:t>
       </w:r>
     </w:p>
     <w:p>

</xml_diff>